<commit_message>
Add AF-2 to AF-5 coverage data to Table 1
All 5 AF expert codelists now listed with source codes, dictionary
coverage, and not-in-dictionary counts. Pairwise calculations use
only dictionary-present codes.

Co-Authored-By: Claude Opus 4.6 <noreply@anthropic.com>
</commit_message>
<xml_diff>
--- a/dissertation_data_summary.docx
+++ b/dissertation_data_summary.docx
@@ -182,6 +182,12 @@
             <w:insideH w:val="single" w:color="auto" w:sz="4" w:space="0"/>
             <w:insideV w:val="single" w:color="auto" w:sz="4" w:space="0"/>
           </w:tblBorders>
+          <w:tblCellMar>
+            <w:top w:w="0" w:type="dxa"/>
+            <w:left w:w="108" w:type="dxa"/>
+            <w:bottom w:w="0" w:type="dxa"/>
+            <w:right w:w="108" w:type="dxa"/>
+          </w:tblCellMar>
         </w:tblPrEx>
         <w:trPr>
           <w:jc w:val="center"/>
@@ -758,7 +764,7 @@
                 <w:rFonts w:ascii="Calibri" w:hAnsi="Calibri"/>
                 <w:sz w:val="18"/>
               </w:rPr>
-              <w:t>Atrial Fibrillation</w:t>
+              <w:t xml:space="preserve">Atrial Fibrillation (AF-1)</w:t>
             </w:r>
           </w:p>
         </w:tc>
@@ -865,6 +871,582 @@
                 <w:sz w:val="18"/>
               </w:rPr>
               <w:t>100.0%</w:t>
+            </w:r>
+          </w:p>
+        </w:tc>
+      </w:tr>
+      <w:tr>
+        <w:tblPrEx>
+          <w:tblBorders>
+            <w:top w:val="single" w:color="auto" w:sz="4" w:space="0"/>
+            <w:left w:val="single" w:color="auto" w:sz="4" w:space="0"/>
+            <w:bottom w:val="single" w:color="auto" w:sz="4" w:space="0"/>
+            <w:right w:val="single" w:color="auto" w:sz="4" w:space="0"/>
+            <w:insideH w:val="single" w:color="auto" w:sz="4" w:space="0"/>
+            <w:insideV w:val="single" w:color="auto" w:sz="4" w:space="0"/>
+          </w:tblBorders>
+          <w:tblCellMar>
+            <w:top w:w="0" w:type="dxa"/>
+            <w:left w:w="108" w:type="dxa"/>
+            <w:bottom w:w="0" w:type="dxa"/>
+            <w:right w:w="108" w:type="dxa"/>
+          </w:tblCellMar>
+        </w:tblPrEx>
+        <w:trPr>
+          <w:jc w:val="center"/>
+        </w:trPr>
+        <w:tc>
+          <w:tcPr>
+            <w:tcW w:w="1234" w:type="dxa"/>
+          </w:tcPr>
+          <w:p>
+            <w:pPr>
+              <w:spacing w:line="240" w:lineRule="auto"/>
+            </w:pPr>
+            <w:r>
+              <w:rPr>
+                <w:rFonts w:ascii="Calibri" w:hAnsi="Calibri"/>
+                <w:sz w:val="18"/>
+              </w:rPr>
+              <w:t xml:space="preserve">Atrial Fibrillation (AF-2)</w:t>
+            </w:r>
+          </w:p>
+        </w:tc>
+        <w:tc>
+          <w:tcPr>
+            <w:tcW w:w="1234" w:type="dxa"/>
+          </w:tcPr>
+          <w:p>
+            <w:pPr>
+              <w:spacing w:line="240" w:lineRule="auto"/>
+            </w:pPr>
+            <w:r>
+              <w:rPr>
+                <w:rFonts w:ascii="Calibri" w:hAnsi="Calibri"/>
+                <w:sz w:val="18"/>
+              </w:rPr>
+              <w:t xml:space="preserve">Medical</w:t>
+            </w:r>
+          </w:p>
+        </w:tc>
+        <w:tc>
+          <w:tcPr>
+            <w:tcW w:w="1234" w:type="dxa"/>
+          </w:tcPr>
+          <w:p>
+            <w:pPr>
+              <w:spacing w:line="240" w:lineRule="auto"/>
+            </w:pPr>
+            <w:r>
+              <w:rPr>
+                <w:rFonts w:ascii="Calibri" w:hAnsi="Calibri"/>
+                <w:sz w:val="18"/>
+              </w:rPr>
+              <w:t xml:space="preserve">HDR UK</w:t>
+            </w:r>
+          </w:p>
+        </w:tc>
+        <w:tc>
+          <w:tcPr>
+            <w:tcW w:w="1234" w:type="dxa"/>
+          </w:tcPr>
+          <w:p>
+            <w:pPr>
+              <w:spacing w:line="240" w:lineRule="auto"/>
+              <w:jc w:val="right"/>
+            </w:pPr>
+            <w:r>
+              <w:rPr>
+                <w:rFonts w:ascii="Calibri" w:hAnsi="Calibri"/>
+                <w:sz w:val="18"/>
+              </w:rPr>
+              <w:t xml:space="preserve">43</w:t>
+            </w:r>
+          </w:p>
+        </w:tc>
+        <w:tc>
+          <w:tcPr>
+            <w:tcW w:w="1234" w:type="dxa"/>
+          </w:tcPr>
+          <w:p>
+            <w:pPr>
+              <w:spacing w:line="240" w:lineRule="auto"/>
+              <w:jc w:val="right"/>
+            </w:pPr>
+            <w:r>
+              <w:rPr>
+                <w:rFonts w:ascii="Calibri" w:hAnsi="Calibri"/>
+                <w:sz w:val="18"/>
+              </w:rPr>
+              <w:t xml:space="preserve">38</w:t>
+            </w:r>
+          </w:p>
+        </w:tc>
+        <w:tc>
+          <w:tcPr>
+            <w:tcW w:w="1234" w:type="dxa"/>
+          </w:tcPr>
+          <w:p>
+            <w:pPr>
+              <w:spacing w:line="240" w:lineRule="auto"/>
+              <w:jc w:val="right"/>
+            </w:pPr>
+            <w:r>
+              <w:rPr>
+                <w:rFonts w:ascii="Calibri" w:hAnsi="Calibri"/>
+                <w:sz w:val="18"/>
+              </w:rPr>
+              <w:t xml:space="preserve">5</w:t>
+            </w:r>
+          </w:p>
+        </w:tc>
+        <w:tc>
+          <w:tcPr>
+            <w:tcW w:w="1234" w:type="dxa"/>
+          </w:tcPr>
+          <w:p>
+            <w:pPr>
+              <w:spacing w:line="240" w:lineRule="auto"/>
+              <w:jc w:val="right"/>
+            </w:pPr>
+            <w:r>
+              <w:rPr>
+                <w:rFonts w:ascii="Calibri" w:hAnsi="Calibri"/>
+                <w:sz w:val="18"/>
+              </w:rPr>
+              <w:t xml:space="preserve">88.4%</w:t>
+            </w:r>
+          </w:p>
+        </w:tc>
+      </w:tr>
+      <w:tr>
+        <w:tblPrEx>
+          <w:tblBorders>
+            <w:top w:val="single" w:color="auto" w:sz="4" w:space="0"/>
+            <w:left w:val="single" w:color="auto" w:sz="4" w:space="0"/>
+            <w:bottom w:val="single" w:color="auto" w:sz="4" w:space="0"/>
+            <w:right w:val="single" w:color="auto" w:sz="4" w:space="0"/>
+            <w:insideH w:val="single" w:color="auto" w:sz="4" w:space="0"/>
+            <w:insideV w:val="single" w:color="auto" w:sz="4" w:space="0"/>
+          </w:tblBorders>
+          <w:tblCellMar>
+            <w:top w:w="0" w:type="dxa"/>
+            <w:left w:w="108" w:type="dxa"/>
+            <w:bottom w:w="0" w:type="dxa"/>
+            <w:right w:w="108" w:type="dxa"/>
+          </w:tblCellMar>
+        </w:tblPrEx>
+        <w:trPr>
+          <w:jc w:val="center"/>
+        </w:trPr>
+        <w:tc>
+          <w:tcPr>
+            <w:tcW w:w="1234" w:type="dxa"/>
+          </w:tcPr>
+          <w:p>
+            <w:pPr>
+              <w:spacing w:line="240" w:lineRule="auto"/>
+            </w:pPr>
+            <w:r>
+              <w:rPr>
+                <w:rFonts w:ascii="Calibri" w:hAnsi="Calibri"/>
+                <w:sz w:val="18"/>
+              </w:rPr>
+              <w:t xml:space="preserve">Atrial Fibrillation (AF-3)</w:t>
+            </w:r>
+          </w:p>
+        </w:tc>
+        <w:tc>
+          <w:tcPr>
+            <w:tcW w:w="1234" w:type="dxa"/>
+          </w:tcPr>
+          <w:p>
+            <w:pPr>
+              <w:spacing w:line="240" w:lineRule="auto"/>
+            </w:pPr>
+            <w:r>
+              <w:rPr>
+                <w:rFonts w:ascii="Calibri" w:hAnsi="Calibri"/>
+                <w:sz w:val="18"/>
+              </w:rPr>
+              <w:t xml:space="preserve">Medical</w:t>
+            </w:r>
+          </w:p>
+        </w:tc>
+        <w:tc>
+          <w:tcPr>
+            <w:tcW w:w="1234" w:type="dxa"/>
+          </w:tcPr>
+          <w:p>
+            <w:pPr>
+              <w:spacing w:line="240" w:lineRule="auto"/>
+            </w:pPr>
+            <w:r>
+              <w:rPr>
+                <w:rFonts w:ascii="Calibri" w:hAnsi="Calibri"/>
+                <w:sz w:val="18"/>
+              </w:rPr>
+              <w:t xml:space="preserve">LSHTM</w:t>
+            </w:r>
+          </w:p>
+        </w:tc>
+        <w:tc>
+          <w:tcPr>
+            <w:tcW w:w="1234" w:type="dxa"/>
+          </w:tcPr>
+          <w:p>
+            <w:pPr>
+              <w:spacing w:line="240" w:lineRule="auto"/>
+              <w:jc w:val="right"/>
+            </w:pPr>
+            <w:r>
+              <w:rPr>
+                <w:rFonts w:ascii="Calibri" w:hAnsi="Calibri"/>
+                <w:sz w:val="18"/>
+              </w:rPr>
+              <w:t xml:space="preserve">35</w:t>
+            </w:r>
+          </w:p>
+        </w:tc>
+        <w:tc>
+          <w:tcPr>
+            <w:tcW w:w="1234" w:type="dxa"/>
+          </w:tcPr>
+          <w:p>
+            <w:pPr>
+              <w:spacing w:line="240" w:lineRule="auto"/>
+              <w:jc w:val="right"/>
+            </w:pPr>
+            <w:r>
+              <w:rPr>
+                <w:rFonts w:ascii="Calibri" w:hAnsi="Calibri"/>
+                <w:sz w:val="18"/>
+              </w:rPr>
+              <w:t xml:space="preserve">30</w:t>
+            </w:r>
+          </w:p>
+        </w:tc>
+        <w:tc>
+          <w:tcPr>
+            <w:tcW w:w="1234" w:type="dxa"/>
+          </w:tcPr>
+          <w:p>
+            <w:pPr>
+              <w:spacing w:line="240" w:lineRule="auto"/>
+              <w:jc w:val="right"/>
+            </w:pPr>
+            <w:r>
+              <w:rPr>
+                <w:rFonts w:ascii="Calibri" w:hAnsi="Calibri"/>
+                <w:sz w:val="18"/>
+              </w:rPr>
+              <w:t xml:space="preserve">5</w:t>
+            </w:r>
+          </w:p>
+        </w:tc>
+        <w:tc>
+          <w:tcPr>
+            <w:tcW w:w="1234" w:type="dxa"/>
+          </w:tcPr>
+          <w:p>
+            <w:pPr>
+              <w:spacing w:line="240" w:lineRule="auto"/>
+              <w:jc w:val="right"/>
+            </w:pPr>
+            <w:r>
+              <w:rPr>
+                <w:rFonts w:ascii="Calibri" w:hAnsi="Calibri"/>
+                <w:sz w:val="18"/>
+              </w:rPr>
+              <w:t xml:space="preserve">85.7%</w:t>
+            </w:r>
+          </w:p>
+        </w:tc>
+      </w:tr>
+      <w:tr>
+        <w:tblPrEx>
+          <w:tblBorders>
+            <w:top w:val="single" w:color="auto" w:sz="4" w:space="0"/>
+            <w:left w:val="single" w:color="auto" w:sz="4" w:space="0"/>
+            <w:bottom w:val="single" w:color="auto" w:sz="4" w:space="0"/>
+            <w:right w:val="single" w:color="auto" w:sz="4" w:space="0"/>
+            <w:insideH w:val="single" w:color="auto" w:sz="4" w:space="0"/>
+            <w:insideV w:val="single" w:color="auto" w:sz="4" w:space="0"/>
+          </w:tblBorders>
+          <w:tblCellMar>
+            <w:top w:w="0" w:type="dxa"/>
+            <w:left w:w="108" w:type="dxa"/>
+            <w:bottom w:w="0" w:type="dxa"/>
+            <w:right w:w="108" w:type="dxa"/>
+          </w:tblCellMar>
+        </w:tblPrEx>
+        <w:trPr>
+          <w:jc w:val="center"/>
+        </w:trPr>
+        <w:tc>
+          <w:tcPr>
+            <w:tcW w:w="1234" w:type="dxa"/>
+          </w:tcPr>
+          <w:p>
+            <w:pPr>
+              <w:spacing w:line="240" w:lineRule="auto"/>
+            </w:pPr>
+            <w:r>
+              <w:rPr>
+                <w:rFonts w:ascii="Calibri" w:hAnsi="Calibri"/>
+                <w:sz w:val="18"/>
+              </w:rPr>
+              <w:t xml:space="preserve">Atrial Fibrillation (AF-4)</w:t>
+            </w:r>
+          </w:p>
+        </w:tc>
+        <w:tc>
+          <w:tcPr>
+            <w:tcW w:w="1234" w:type="dxa"/>
+          </w:tcPr>
+          <w:p>
+            <w:pPr>
+              <w:spacing w:line="240" w:lineRule="auto"/>
+            </w:pPr>
+            <w:r>
+              <w:rPr>
+                <w:rFonts w:ascii="Calibri" w:hAnsi="Calibri"/>
+                <w:sz w:val="18"/>
+              </w:rPr>
+              <w:t xml:space="preserve">Medical</w:t>
+            </w:r>
+          </w:p>
+        </w:tc>
+        <w:tc>
+          <w:tcPr>
+            <w:tcW w:w="1234" w:type="dxa"/>
+          </w:tcPr>
+          <w:p>
+            <w:pPr>
+              <w:spacing w:line="240" w:lineRule="auto"/>
+            </w:pPr>
+            <w:r>
+              <w:rPr>
+                <w:rFonts w:ascii="Calibri" w:hAnsi="Calibri"/>
+                <w:sz w:val="18"/>
+              </w:rPr>
+              <w:t xml:space="preserve">LSHTM</w:t>
+            </w:r>
+          </w:p>
+        </w:tc>
+        <w:tc>
+          <w:tcPr>
+            <w:tcW w:w="1234" w:type="dxa"/>
+          </w:tcPr>
+          <w:p>
+            <w:pPr>
+              <w:spacing w:line="240" w:lineRule="auto"/>
+              <w:jc w:val="right"/>
+            </w:pPr>
+            <w:r>
+              <w:rPr>
+                <w:rFonts w:ascii="Calibri" w:hAnsi="Calibri"/>
+                <w:sz w:val="18"/>
+              </w:rPr>
+              <w:t xml:space="preserve">25</w:t>
+            </w:r>
+          </w:p>
+        </w:tc>
+        <w:tc>
+          <w:tcPr>
+            <w:tcW w:w="1234" w:type="dxa"/>
+          </w:tcPr>
+          <w:p>
+            <w:pPr>
+              <w:spacing w:line="240" w:lineRule="auto"/>
+              <w:jc w:val="right"/>
+            </w:pPr>
+            <w:r>
+              <w:rPr>
+                <w:rFonts w:ascii="Calibri" w:hAnsi="Calibri"/>
+                <w:sz w:val="18"/>
+              </w:rPr>
+              <w:t xml:space="preserve">25</w:t>
+            </w:r>
+          </w:p>
+        </w:tc>
+        <w:tc>
+          <w:tcPr>
+            <w:tcW w:w="1234" w:type="dxa"/>
+          </w:tcPr>
+          <w:p>
+            <w:pPr>
+              <w:spacing w:line="240" w:lineRule="auto"/>
+              <w:jc w:val="right"/>
+            </w:pPr>
+            <w:r>
+              <w:rPr>
+                <w:rFonts w:ascii="Calibri" w:hAnsi="Calibri"/>
+                <w:sz w:val="18"/>
+              </w:rPr>
+              <w:t xml:space="preserve">0</w:t>
+            </w:r>
+          </w:p>
+        </w:tc>
+        <w:tc>
+          <w:tcPr>
+            <w:tcW w:w="1234" w:type="dxa"/>
+          </w:tcPr>
+          <w:p>
+            <w:pPr>
+              <w:spacing w:line="240" w:lineRule="auto"/>
+              <w:jc w:val="right"/>
+            </w:pPr>
+            <w:r>
+              <w:rPr>
+                <w:rFonts w:ascii="Calibri" w:hAnsi="Calibri"/>
+                <w:sz w:val="18"/>
+              </w:rPr>
+              <w:t xml:space="preserve">100.0%</w:t>
+            </w:r>
+          </w:p>
+        </w:tc>
+      </w:tr>
+      <w:tr>
+        <w:tblPrEx>
+          <w:tblBorders>
+            <w:top w:val="single" w:color="auto" w:sz="4" w:space="0"/>
+            <w:left w:val="single" w:color="auto" w:sz="4" w:space="0"/>
+            <w:bottom w:val="single" w:color="auto" w:sz="4" w:space="0"/>
+            <w:right w:val="single" w:color="auto" w:sz="4" w:space="0"/>
+            <w:insideH w:val="single" w:color="auto" w:sz="4" w:space="0"/>
+            <w:insideV w:val="single" w:color="auto" w:sz="4" w:space="0"/>
+          </w:tblBorders>
+          <w:tblCellMar>
+            <w:top w:w="0" w:type="dxa"/>
+            <w:left w:w="108" w:type="dxa"/>
+            <w:bottom w:w="0" w:type="dxa"/>
+            <w:right w:w="108" w:type="dxa"/>
+          </w:tblCellMar>
+        </w:tblPrEx>
+        <w:trPr>
+          <w:jc w:val="center"/>
+        </w:trPr>
+        <w:tc>
+          <w:tcPr>
+            <w:tcW w:w="1234" w:type="dxa"/>
+          </w:tcPr>
+          <w:p>
+            <w:pPr>
+              <w:spacing w:line="240" w:lineRule="auto"/>
+            </w:pPr>
+            <w:r>
+              <w:rPr>
+                <w:rFonts w:ascii="Calibri" w:hAnsi="Calibri"/>
+                <w:sz w:val="18"/>
+              </w:rPr>
+              <w:t xml:space="preserve">Atrial Fibrillation (AF-5)</w:t>
+            </w:r>
+          </w:p>
+        </w:tc>
+        <w:tc>
+          <w:tcPr>
+            <w:tcW w:w="1234" w:type="dxa"/>
+          </w:tcPr>
+          <w:p>
+            <w:pPr>
+              <w:spacing w:line="240" w:lineRule="auto"/>
+            </w:pPr>
+            <w:r>
+              <w:rPr>
+                <w:rFonts w:ascii="Calibri" w:hAnsi="Calibri"/>
+                <w:sz w:val="18"/>
+              </w:rPr>
+              <w:t xml:space="preserve">Medical</w:t>
+            </w:r>
+          </w:p>
+        </w:tc>
+        <w:tc>
+          <w:tcPr>
+            <w:tcW w:w="1234" w:type="dxa"/>
+          </w:tcPr>
+          <w:p>
+            <w:pPr>
+              <w:spacing w:line="240" w:lineRule="auto"/>
+            </w:pPr>
+            <w:r>
+              <w:rPr>
+                <w:rFonts w:ascii="Calibri" w:hAnsi="Calibri"/>
+                <w:sz w:val="18"/>
+              </w:rPr>
+              <w:t xml:space="preserve">LSHTM</w:t>
+            </w:r>
+          </w:p>
+        </w:tc>
+        <w:tc>
+          <w:tcPr>
+            <w:tcW w:w="1234" w:type="dxa"/>
+          </w:tcPr>
+          <w:p>
+            <w:pPr>
+              <w:spacing w:line="240" w:lineRule="auto"/>
+              <w:jc w:val="right"/>
+            </w:pPr>
+            <w:r>
+              <w:rPr>
+                <w:rFonts w:ascii="Calibri" w:hAnsi="Calibri"/>
+                <w:sz w:val="18"/>
+              </w:rPr>
+              <w:t xml:space="preserve">37</w:t>
+            </w:r>
+          </w:p>
+        </w:tc>
+        <w:tc>
+          <w:tcPr>
+            <w:tcW w:w="1234" w:type="dxa"/>
+          </w:tcPr>
+          <w:p>
+            <w:pPr>
+              <w:spacing w:line="240" w:lineRule="auto"/>
+              <w:jc w:val="right"/>
+            </w:pPr>
+            <w:r>
+              <w:rPr>
+                <w:rFonts w:ascii="Calibri" w:hAnsi="Calibri"/>
+                <w:sz w:val="18"/>
+              </w:rPr>
+              <w:t xml:space="preserve">31</w:t>
+            </w:r>
+          </w:p>
+        </w:tc>
+        <w:tc>
+          <w:tcPr>
+            <w:tcW w:w="1234" w:type="dxa"/>
+          </w:tcPr>
+          <w:p>
+            <w:pPr>
+              <w:spacing w:line="240" w:lineRule="auto"/>
+              <w:jc w:val="right"/>
+            </w:pPr>
+            <w:r>
+              <w:rPr>
+                <w:rFonts w:ascii="Calibri" w:hAnsi="Calibri"/>
+                <w:sz w:val="18"/>
+              </w:rPr>
+              <w:t xml:space="preserve">6</w:t>
+            </w:r>
+          </w:p>
+        </w:tc>
+        <w:tc>
+          <w:tcPr>
+            <w:tcW w:w="1234" w:type="dxa"/>
+          </w:tcPr>
+          <w:p>
+            <w:pPr>
+              <w:spacing w:line="240" w:lineRule="auto"/>
+              <w:jc w:val="right"/>
+            </w:pPr>
+            <w:r>
+              <w:rPr>
+                <w:rFonts w:ascii="Calibri" w:hAnsi="Calibri"/>
+                <w:sz w:val="18"/>
+              </w:rPr>
+              <w:t xml:space="preserve">83.8%</w:t>
             </w:r>
           </w:p>
         </w:tc>
@@ -2199,7 +2781,7 @@
           <w:rFonts w:ascii="Calibri" w:hAnsi="Calibri"/>
           <w:sz w:val="20"/>
         </w:rPr>
-        <w:t>AF has 5 expert codelists: AF-1 ClinicalCodes (18 codes), AF-2 HDR UK (38 codes), AF-3 LSHTM (30 codes), AF-4 LSHTM (25 codes), AF-5 LSHTM (31 codes</w:t>
+        <w:t xml:space="preserve">AF-1 is the primary reference for main evaluation (Table 2). All 5 AF codelists are used for inter-expert pairwise comparison (Table 3).</w:t>
       </w:r>
     </w:p>
     <w:p>
@@ -9767,6 +10349,14 @@
       </w:tr>
       <w:tr>
         <w:tblPrEx>
+          <w:tblBorders>
+            <w:top w:val="single" w:color="auto" w:sz="4" w:space="0"/>
+            <w:left w:val="single" w:color="auto" w:sz="4" w:space="0"/>
+            <w:bottom w:val="single" w:color="auto" w:sz="4" w:space="0"/>
+            <w:right w:val="single" w:color="auto" w:sz="4" w:space="0"/>
+            <w:insideH w:val="single" w:color="auto" w:sz="4" w:space="0"/>
+            <w:insideV w:val="single" w:color="auto" w:sz="4" w:space="0"/>
+          </w:tblBorders>
           <w:tblCellMar>
             <w:top w:w="0" w:type="dxa"/>
             <w:left w:w="108" w:type="dxa"/>
@@ -13562,7 +14152,7 @@
                 <w:rFonts w:ascii="Calibri" w:hAnsi="Calibri"/>
                 <w:sz w:val="18"/>
               </w:rPr>
-              <w:t xml:space="preserve">⚠ Valid diagnosis subtype (reference gap)</w:t>
+              <w:t>⚠ Valid diagnosis subtype (reference gap)</w:t>
             </w:r>
           </w:p>
         </w:tc>
@@ -13651,7 +14241,7 @@
                 <w:rFonts w:ascii="Calibri" w:hAnsi="Calibri"/>
                 <w:sz w:val="18"/>
               </w:rPr>
-              <w:t xml:space="preserve">⚠ Semantic drift (related condition)</w:t>
+              <w:t>⚠ Semantic drift (related condition)</w:t>
             </w:r>
           </w:p>
         </w:tc>
@@ -14073,11 +14663,11 @@
       </w:pPr>
       <w:r>
         <w:rPr>
+          <w:rFonts w:ascii="Calibri" w:hAnsi="Calibri"/>
           <w:i/>
           <w:sz w:val="18"/>
-          <w:rFonts w:ascii="Calibri" w:hAnsi="Calibri"/>
         </w:rPr>
-        <w:t xml:space="preserve">⚠ = Unsure — requires clinical review to confirm classification.</w:t>
+        <w:t>⚠ = Unsure — requires clinical review to confirm classification.</w:t>
       </w:r>
     </w:p>
     <w:p/>
@@ -14741,7 +15331,7 @@
                 <w:rFonts w:ascii="Calibri" w:hAnsi="Calibri"/>
                 <w:sz w:val="18"/>
               </w:rPr>
-              <w:t xml:space="preserve">⚠ Sequelae/historical code</w:t>
+              <w:t>⚠ Sequelae/historical code</w:t>
             </w:r>
           </w:p>
         </w:tc>
@@ -14830,7 +15420,7 @@
                 <w:rFonts w:ascii="Calibri" w:hAnsi="Calibri"/>
                 <w:sz w:val="18"/>
               </w:rPr>
-              <w:t xml:space="preserve">⚠ Complication code</w:t>
+              <w:t>⚠ Complication code</w:t>
             </w:r>
           </w:p>
         </w:tc>
@@ -15008,7 +15598,7 @@
                 <w:rFonts w:ascii="Calibri" w:hAnsi="Calibri"/>
                 <w:sz w:val="18"/>
               </w:rPr>
-              <w:t xml:space="preserve">⚠ Missed valid diagnosis</w:t>
+              <w:t>⚠ Missed valid diagnosis</w:t>
             </w:r>
           </w:p>
         </w:tc>
@@ -15074,11 +15664,11 @@
       </w:pPr>
       <w:r>
         <w:rPr>
+          <w:rFonts w:ascii="Calibri" w:hAnsi="Calibri"/>
           <w:i/>
           <w:sz w:val="18"/>
-          <w:rFonts w:ascii="Calibri" w:hAnsi="Calibri"/>
         </w:rPr>
-        <w:t xml:space="preserve">⚠ = Unsure — requires clinical review to confirm classification.</w:t>
+        <w:t>⚠ = Unsure — requires clinical review to confirm classification.</w:t>
       </w:r>
     </w:p>
     <w:p/>
@@ -15091,6 +15681,22 @@
         </w:rPr>
         <w:t>Note: 154 reference codes not in CPRD Aurum dictionary are excluded (reported in Table 1). Total FN here reflects only codes the AI could have found.</w:t>
       </w:r>
+    </w:p>
+    <w:p>
+      <w:pPr>
+        <w:rPr>
+          <w:rFonts w:ascii="Calibri" w:hAnsi="Calibri"/>
+          <w:sz w:val="20"/>
+        </w:rPr>
+      </w:pPr>
+    </w:p>
+    <w:p>
+      <w:pPr>
+        <w:rPr>
+          <w:rFonts w:ascii="Calibri" w:hAnsi="Calibri"/>
+          <w:sz w:val="20"/>
+        </w:rPr>
+      </w:pPr>
     </w:p>
     <w:p>
       <w:r>
@@ -15164,6 +15770,113 @@
         </w:rPr>
         <w:t>: Genuine diagnosis codes the AI failed to find -- the true under-inclusion rate</w:t>
       </w:r>
+    </w:p>
+    <w:p>
+      <w:pPr>
+        <w:pStyle w:val="16"/>
+        <w:numPr>
+          <w:numId w:val="0"/>
+        </w:numPr>
+        <w:spacing w:after="80" w:line="276" w:lineRule="auto"/>
+        <w:contextualSpacing/>
+        <w:rPr>
+          <w:rFonts w:ascii="Calibri" w:hAnsi="Calibri"/>
+          <w:sz w:val="20"/>
+        </w:rPr>
+      </w:pPr>
+    </w:p>
+    <w:p>
+      <w:pPr>
+        <w:pStyle w:val="16"/>
+        <w:numPr>
+          <w:numId w:val="0"/>
+        </w:numPr>
+        <w:spacing w:after="80" w:line="276" w:lineRule="auto"/>
+        <w:contextualSpacing/>
+        <w:rPr>
+          <w:rFonts w:hint="eastAsia" w:ascii="Calibri" w:hAnsi="Calibri" w:eastAsia="宋体"/>
+          <w:sz w:val="20"/>
+          <w:lang w:eastAsia="zh-CN"/>
+        </w:rPr>
+      </w:pPr>
+      <w:r>
+        <w:rPr>
+          <w:rFonts w:hint="eastAsia" w:ascii="Calibri" w:hAnsi="Calibri" w:eastAsia="宋体"/>
+          <w:sz w:val="20"/>
+          <w:lang w:eastAsia="zh-CN"/>
+        </w:rPr>
+        <w:drawing>
+          <wp:inline distT="0" distB="0" distL="114300" distR="114300">
+            <wp:extent cx="5480050" cy="2908935"/>
+            <wp:effectExtent l="0" t="0" r="6350" b="5715"/>
+            <wp:docPr id="7" name="图片 7" descr="fig3_error_classification"/>
+            <wp:cNvGraphicFramePr>
+              <ns4:graphicFrameLocks noChangeAspect="1"/>
+            </wp:cNvGraphicFramePr>
+            <ns4:graphic>
+              <ns4:graphicData uri="http://schemas.openxmlformats.org/drawingml/2006/picture">
+                <ns5:pic>
+                  <ns5:nvPicPr>
+                    <ns5:cNvPr id="7" name="图片 7" descr="fig3_error_classification"/>
+                    <ns5:cNvPicPr>
+                      <ns4:picLocks noChangeAspect="1"/>
+                    </ns5:cNvPicPr>
+                  </ns5:nvPicPr>
+                  <ns5:blipFill>
+                    <ns4:blip r:embed="rId14">
+                      <ns4:extLst>
+                        <ns4:ext uri="{96DAC541-7B7A-43D3-8B79-37D633B846F1}">
+                          <ns7:svgBlip r:embed="rId15"/>
+                        </ns4:ext>
+                      </ns4:extLst>
+                    </ns4:blip>
+                    <ns4:stretch>
+                      <ns4:fillRect/>
+                    </ns4:stretch>
+                  </ns5:blipFill>
+                  <ns5:spPr>
+                    <ns4:xfrm>
+                      <ns4:off x="0" y="0"/>
+                      <ns4:ext cx="5480050" cy="2908935"/>
+                    </ns4:xfrm>
+                    <ns4:prstGeom prst="rect">
+                      <ns4:avLst/>
+                    </ns4:prstGeom>
+                  </ns5:spPr>
+                </ns5:pic>
+              </ns4:graphicData>
+            </ns4:graphic>
+          </wp:inline>
+        </w:drawing>
+      </w:r>
+    </w:p>
+    <w:p>
+      <w:pPr>
+        <w:pStyle w:val="16"/>
+        <w:numPr>
+          <w:numId w:val="0"/>
+        </w:numPr>
+        <w:spacing w:after="80" w:line="276" w:lineRule="auto"/>
+        <w:contextualSpacing/>
+        <w:rPr>
+          <w:rFonts w:ascii="Calibri" w:hAnsi="Calibri"/>
+          <w:sz w:val="20"/>
+        </w:rPr>
+      </w:pPr>
+    </w:p>
+    <w:p>
+      <w:pPr>
+        <w:pStyle w:val="16"/>
+        <w:numPr>
+          <w:numId w:val="0"/>
+        </w:numPr>
+        <w:spacing w:after="80" w:line="276" w:lineRule="auto"/>
+        <w:contextualSpacing/>
+        <w:rPr>
+          <w:rFonts w:ascii="Calibri" w:hAnsi="Calibri"/>
+          <w:sz w:val="20"/>
+        </w:rPr>
+      </w:pPr>
       <w:bookmarkStart w:id="0" w:name="_GoBack"/>
       <w:bookmarkEnd w:id="0"/>
     </w:p>
@@ -18280,7 +18993,7 @@
     <w:lsdException w:uiPriority="99" w:name="Normal Indent"/>
     <w:lsdException w:uiPriority="99" w:name="footnote text"/>
     <w:lsdException w:uiPriority="99" w:name="annotation text"/>
-    <w:lsdException w:uiPriority="99" w:semiHidden="0" w:name="header"/>
+    <w:lsdException w:qFormat="1" w:uiPriority="99" w:semiHidden="0" w:name="header"/>
     <w:lsdException w:uiPriority="99" w:semiHidden="0" w:name="footer"/>
     <w:lsdException w:uiPriority="99" w:name="index heading"/>
     <w:lsdException w:qFormat="1" w:uiPriority="35" w:name="caption"/>
@@ -18299,7 +19012,7 @@
     <w:lsdException w:qFormat="1" w:uiPriority="99" w:semiHidden="0" w:name="List"/>
     <w:lsdException w:qFormat="1" w:uiPriority="99" w:semiHidden="0" w:name="List Bullet"/>
     <w:lsdException w:qFormat="1" w:uiPriority="99" w:semiHidden="0" w:name="List Number"/>
-    <w:lsdException w:uiPriority="99" w:semiHidden="0" w:name="List 2"/>
+    <w:lsdException w:qFormat="1" w:uiPriority="99" w:semiHidden="0" w:name="List 2"/>
     <w:lsdException w:qFormat="1" w:uiPriority="99" w:semiHidden="0" w:name="List 3"/>
     <w:lsdException w:uiPriority="99" w:name="List 4"/>
     <w:lsdException w:uiPriority="99" w:name="List 5"/>
@@ -18426,9 +19139,9 @@
     <w:lsdException w:qFormat="1" w:unhideWhenUsed="0" w:uiPriority="66" w:semiHidden="0" w:name="Medium List 2 Accent 1"/>
     <w:lsdException w:unhideWhenUsed="0" w:uiPriority="67" w:semiHidden="0" w:name="Medium Grid 1 Accent 1"/>
     <w:lsdException w:unhideWhenUsed="0" w:uiPriority="68" w:semiHidden="0" w:name="Medium Grid 2 Accent 1"/>
-    <w:lsdException w:unhideWhenUsed="0" w:uiPriority="69" w:semiHidden="0" w:name="Medium Grid 3 Accent 1"/>
+    <w:lsdException w:qFormat="1" w:unhideWhenUsed="0" w:uiPriority="69" w:semiHidden="0" w:name="Medium Grid 3 Accent 1"/>
     <w:lsdException w:qFormat="1" w:unhideWhenUsed="0" w:uiPriority="70" w:semiHidden="0" w:name="Dark List Accent 1"/>
-    <w:lsdException w:unhideWhenUsed="0" w:uiPriority="71" w:semiHidden="0" w:name="Colorful Shading Accent 1"/>
+    <w:lsdException w:qFormat="1" w:unhideWhenUsed="0" w:uiPriority="71" w:semiHidden="0" w:name="Colorful Shading Accent 1"/>
     <w:lsdException w:qFormat="1" w:unhideWhenUsed="0" w:uiPriority="72" w:semiHidden="0" w:name="Colorful List Accent 1"/>
     <w:lsdException w:unhideWhenUsed="0" w:uiPriority="73" w:semiHidden="0" w:name="Colorful Grid Accent 1"/>
     <w:lsdException w:qFormat="1" w:unhideWhenUsed="0" w:uiPriority="60" w:semiHidden="0" w:name="Light Shading Accent 2"/>
@@ -18441,10 +19154,10 @@
     <w:lsdException w:qFormat="1" w:unhideWhenUsed="0" w:uiPriority="67" w:semiHidden="0" w:name="Medium Grid 1 Accent 2"/>
     <w:lsdException w:qFormat="1" w:unhideWhenUsed="0" w:uiPriority="68" w:semiHidden="0" w:name="Medium Grid 2 Accent 2"/>
     <w:lsdException w:qFormat="1" w:unhideWhenUsed="0" w:uiPriority="69" w:semiHidden="0" w:name="Medium Grid 3 Accent 2"/>
-    <w:lsdException w:unhideWhenUsed="0" w:uiPriority="70" w:semiHidden="0" w:name="Dark List Accent 2"/>
+    <w:lsdException w:qFormat="1" w:unhideWhenUsed="0" w:uiPriority="70" w:semiHidden="0" w:name="Dark List Accent 2"/>
     <w:lsdException w:unhideWhenUsed="0" w:uiPriority="71" w:semiHidden="0" w:name="Colorful Shading Accent 2"/>
     <w:lsdException w:qFormat="1" w:unhideWhenUsed="0" w:uiPriority="72" w:semiHidden="0" w:name="Colorful List Accent 2"/>
-    <w:lsdException w:unhideWhenUsed="0" w:uiPriority="73" w:semiHidden="0" w:name="Colorful Grid Accent 2"/>
+    <w:lsdException w:qFormat="1" w:unhideWhenUsed="0" w:uiPriority="73" w:semiHidden="0" w:name="Colorful Grid Accent 2"/>
     <w:lsdException w:qFormat="1" w:unhideWhenUsed="0" w:uiPriority="60" w:semiHidden="0" w:name="Light Shading Accent 3"/>
     <w:lsdException w:qFormat="1" w:unhideWhenUsed="0" w:uiPriority="61" w:semiHidden="0" w:name="Light List Accent 3"/>
     <w:lsdException w:qFormat="1" w:unhideWhenUsed="0" w:uiPriority="62" w:semiHidden="0" w:name="Light Grid Accent 3"/>
@@ -18453,7 +19166,7 @@
     <w:lsdException w:qFormat="1" w:unhideWhenUsed="0" w:uiPriority="65" w:semiHidden="0" w:name="Medium List 1 Accent 3"/>
     <w:lsdException w:qFormat="1" w:unhideWhenUsed="0" w:uiPriority="66" w:semiHidden="0" w:name="Medium List 2 Accent 3"/>
     <w:lsdException w:qFormat="1" w:unhideWhenUsed="0" w:uiPriority="67" w:semiHidden="0" w:name="Medium Grid 1 Accent 3"/>
-    <w:lsdException w:unhideWhenUsed="0" w:uiPriority="68" w:semiHidden="0" w:name="Medium Grid 2 Accent 3"/>
+    <w:lsdException w:qFormat="1" w:unhideWhenUsed="0" w:uiPriority="68" w:semiHidden="0" w:name="Medium Grid 2 Accent 3"/>
     <w:lsdException w:qFormat="1" w:unhideWhenUsed="0" w:uiPriority="69" w:semiHidden="0" w:name="Medium Grid 3 Accent 3"/>
     <w:lsdException w:qFormat="1" w:unhideWhenUsed="0" w:uiPriority="70" w:semiHidden="0" w:name="Dark List Accent 3"/>
     <w:lsdException w:qFormat="1" w:unhideWhenUsed="0" w:uiPriority="71" w:semiHidden="0" w:name="Colorful Shading Accent 3"/>
@@ -18464,15 +19177,15 @@
     <w:lsdException w:qFormat="1" w:unhideWhenUsed="0" w:uiPriority="62" w:semiHidden="0" w:name="Light Grid Accent 4"/>
     <w:lsdException w:qFormat="1" w:unhideWhenUsed="0" w:uiPriority="63" w:semiHidden="0" w:name="Medium Shading 1 Accent 4"/>
     <w:lsdException w:qFormat="1" w:unhideWhenUsed="0" w:uiPriority="64" w:semiHidden="0" w:name="Medium Shading 2 Accent 4"/>
-    <w:lsdException w:unhideWhenUsed="0" w:uiPriority="65" w:semiHidden="0" w:name="Medium List 1 Accent 4"/>
+    <w:lsdException w:qFormat="1" w:unhideWhenUsed="0" w:uiPriority="65" w:semiHidden="0" w:name="Medium List 1 Accent 4"/>
     <w:lsdException w:qFormat="1" w:unhideWhenUsed="0" w:uiPriority="66" w:semiHidden="0" w:name="Medium List 2 Accent 4"/>
     <w:lsdException w:qFormat="1" w:unhideWhenUsed="0" w:uiPriority="67" w:semiHidden="0" w:name="Medium Grid 1 Accent 4"/>
     <w:lsdException w:qFormat="1" w:unhideWhenUsed="0" w:uiPriority="68" w:semiHidden="0" w:name="Medium Grid 2 Accent 4"/>
     <w:lsdException w:unhideWhenUsed="0" w:uiPriority="69" w:semiHidden="0" w:name="Medium Grid 3 Accent 4"/>
     <w:lsdException w:qFormat="1" w:unhideWhenUsed="0" w:uiPriority="70" w:semiHidden="0" w:name="Dark List Accent 4"/>
-    <w:lsdException w:unhideWhenUsed="0" w:uiPriority="71" w:semiHidden="0" w:name="Colorful Shading Accent 4"/>
+    <w:lsdException w:qFormat="1" w:unhideWhenUsed="0" w:uiPriority="71" w:semiHidden="0" w:name="Colorful Shading Accent 4"/>
     <w:lsdException w:qFormat="1" w:unhideWhenUsed="0" w:uiPriority="72" w:semiHidden="0" w:name="Colorful List Accent 4"/>
-    <w:lsdException w:unhideWhenUsed="0" w:uiPriority="73" w:semiHidden="0" w:name="Colorful Grid Accent 4"/>
+    <w:lsdException w:qFormat="1" w:unhideWhenUsed="0" w:uiPriority="73" w:semiHidden="0" w:name="Colorful Grid Accent 4"/>
     <w:lsdException w:qFormat="1" w:unhideWhenUsed="0" w:uiPriority="60" w:semiHidden="0" w:name="Light Shading Accent 5"/>
     <w:lsdException w:qFormat="1" w:unhideWhenUsed="0" w:uiPriority="61" w:semiHidden="0" w:name="Light List Accent 5"/>
     <w:lsdException w:qFormat="1" w:unhideWhenUsed="0" w:uiPriority="62" w:semiHidden="0" w:name="Light Grid Accent 5"/>
@@ -18485,7 +19198,7 @@
     <w:lsdException w:qFormat="1" w:unhideWhenUsed="0" w:uiPriority="69" w:semiHidden="0" w:name="Medium Grid 3 Accent 5"/>
     <w:lsdException w:qFormat="1" w:unhideWhenUsed="0" w:uiPriority="70" w:semiHidden="0" w:name="Dark List Accent 5"/>
     <w:lsdException w:qFormat="1" w:unhideWhenUsed="0" w:uiPriority="71" w:semiHidden="0" w:name="Colorful Shading Accent 5"/>
-    <w:lsdException w:unhideWhenUsed="0" w:uiPriority="72" w:semiHidden="0" w:name="Colorful List Accent 5"/>
+    <w:lsdException w:qFormat="1" w:unhideWhenUsed="0" w:uiPriority="72" w:semiHidden="0" w:name="Colorful List Accent 5"/>
     <w:lsdException w:qFormat="1" w:unhideWhenUsed="0" w:uiPriority="73" w:semiHidden="0" w:name="Colorful Grid Accent 5"/>
     <w:lsdException w:qFormat="1" w:unhideWhenUsed="0" w:uiPriority="60" w:semiHidden="0" w:name="Light Shading Accent 6"/>
     <w:lsdException w:qFormat="1" w:unhideWhenUsed="0" w:uiPriority="61" w:semiHidden="0" w:name="Light List Accent 6"/>
@@ -18496,7 +19209,7 @@
     <w:lsdException w:qFormat="1" w:unhideWhenUsed="0" w:uiPriority="66" w:semiHidden="0" w:name="Medium List 2 Accent 6"/>
     <w:lsdException w:qFormat="1" w:unhideWhenUsed="0" w:uiPriority="67" w:semiHidden="0" w:name="Medium Grid 1 Accent 6"/>
     <w:lsdException w:unhideWhenUsed="0" w:uiPriority="68" w:semiHidden="0" w:name="Medium Grid 2 Accent 6"/>
-    <w:lsdException w:unhideWhenUsed="0" w:uiPriority="69" w:semiHidden="0" w:name="Medium Grid 3 Accent 6"/>
+    <w:lsdException w:qFormat="1" w:unhideWhenUsed="0" w:uiPriority="69" w:semiHidden="0" w:name="Medium Grid 3 Accent 6"/>
     <w:lsdException w:unhideWhenUsed="0" w:uiPriority="70" w:semiHidden="0" w:name="Dark List Accent 6"/>
     <w:lsdException w:unhideWhenUsed="0" w:uiPriority="71" w:semiHidden="0" w:name="Colorful Shading Accent 6"/>
     <w:lsdException w:qFormat="1" w:unhideWhenUsed="0" w:uiPriority="72" w:semiHidden="0" w:name="Colorful List Accent 6"/>
@@ -18932,6 +19645,7 @@
     <w:name w:val="List 2"/>
     <w:basedOn w:val="1"/>
     <w:unhideWhenUsed/>
+    <w:qFormat/>
     <w:uiPriority w:val="99"/>
     <w:pPr>
       <w:ind w:left="720" w:hanging="360"/>
@@ -18983,6 +19697,7 @@
     <w:basedOn w:val="1"/>
     <w:link w:val="135"/>
     <w:unhideWhenUsed/>
+    <w:qFormat/>
     <w:uiPriority w:val="99"/>
     <w:pPr>
       <w:tabs>
@@ -23638,6 +24353,7 @@
   <w:style w:type="table" w:styleId="73">
     <w:name w:val="Medium List 1 Accent 4"/>
     <w:basedOn w:val="32"/>
+    <w:qFormat/>
     <w:uiPriority w:val="65"/>
     <w:pPr>
       <w:spacing w:after="0" w:line="240" w:lineRule="auto"/>
@@ -25747,6 +26463,7 @@
   <w:style w:type="table" w:styleId="93">
     <w:name w:val="Medium Grid 2 Accent 3"/>
     <w:basedOn w:val="32"/>
+    <w:qFormat/>
     <w:uiPriority w:val="68"/>
     <w:pPr>
       <w:spacing w:after="0" w:line="240" w:lineRule="auto"/>
@@ -26490,6 +27207,7 @@
   <w:style w:type="table" w:styleId="98">
     <w:name w:val="Medium Grid 3 Accent 1"/>
     <w:basedOn w:val="32"/>
+    <w:qFormat/>
     <w:uiPriority w:val="69"/>
     <w:pPr>
       <w:spacing w:after="0" w:line="240" w:lineRule="auto"/>
@@ -27278,6 +27996,7 @@
   <w:style w:type="table" w:styleId="103">
     <w:name w:val="Medium Grid 3 Accent 6"/>
     <w:basedOn w:val="32"/>
+    <w:qFormat/>
     <w:uiPriority w:val="69"/>
     <w:pPr>
       <w:spacing w:after="0" w:line="240" w:lineRule="auto"/>
@@ -27667,6 +28386,7 @@
   <w:style w:type="table" w:styleId="106">
     <w:name w:val="Dark List Accent 2"/>
     <w:basedOn w:val="32"/>
+    <w:qFormat/>
     <w:uiPriority w:val="70"/>
     <w:pPr>
       <w:spacing w:after="0" w:line="240" w:lineRule="auto"/>
@@ -28394,6 +29114,7 @@
   <w:style w:type="table" w:styleId="112">
     <w:name w:val="Colorful Shading Accent 1"/>
     <w:basedOn w:val="32"/>
+    <w:qFormat/>
     <w:uiPriority w:val="71"/>
     <w:pPr>
       <w:spacing w:after="0" w:line="240" w:lineRule="auto"/>
@@ -28819,6 +29540,7 @@
   <w:style w:type="table" w:styleId="115">
     <w:name w:val="Colorful Shading Accent 4"/>
     <w:basedOn w:val="32"/>
+    <w:qFormat/>
     <w:uiPriority w:val="71"/>
     <w:pPr>
       <w:spacing w:after="0" w:line="240" w:lineRule="auto"/>
@@ -29729,6 +30451,7 @@
   <w:style w:type="table" w:styleId="123">
     <w:name w:val="Colorful List Accent 5"/>
     <w:basedOn w:val="32"/>
+    <w:qFormat/>
     <w:uiPriority w:val="72"/>
     <w:pPr>
       <w:spacing w:after="0" w:line="240" w:lineRule="auto"/>
@@ -30107,6 +30830,7 @@
   <w:style w:type="table" w:styleId="127">
     <w:name w:val="Colorful Grid Accent 2"/>
     <w:basedOn w:val="32"/>
+    <w:qFormat/>
     <w:uiPriority w:val="73"/>
     <w:pPr>
       <w:spacing w:after="0" w:line="240" w:lineRule="auto"/>
@@ -30300,6 +31024,7 @@
   <w:style w:type="table" w:styleId="129">
     <w:name w:val="Colorful Grid Accent 4"/>
     <w:basedOn w:val="32"/>
+    <w:qFormat/>
     <w:uiPriority w:val="73"/>
     <w:pPr>
       <w:spacing w:after="0" w:line="240" w:lineRule="auto"/>

</xml_diff>

<commit_message>
Fix Table 1 source counts and update condition abbreviations
- Correct Source Codes for ClinicalCodes-sourced conditions (AF-1: 18→21,
  HF: 84→98, CeVD: 130→161, Insulin: 224→255, Metformin: 79→90)
- Update abbreviations: Hypertension Hyp→HTN, Cerebrovascular Disease CVD→CeVD
- Update note explaining LSHTM vs ClinicalCodes matching differences

Co-Authored-By: Claude Opus 4.6 <noreply@anthropic.com>
</commit_message>
<xml_diff>
--- a/dissertation_data_summary.docx
+++ b/dissertation_data_summary.docx
@@ -1,5 +1,54 @@
 
-<file path=word/document.xml><?xml version="1.0" encoding="utf-8"?>
+<file path=customXml\item1.xml><?xml version="1.0" encoding="utf-8"?>
+<b:Sources xmlns:b="http://schemas.openxmlformats.org/officeDocument/2006/bibliography" xmlns="http://schemas.openxmlformats.org/officeDocument/2006/bibliography" SelectedStyle="/APA.XSL" StyleName="APA"/>
+</file>
+
+<file path=customXml\itemProps1.xml><?xml version="1.0" encoding="utf-8"?>
+<ds:datastoreItem xmlns:ds="http://schemas.openxmlformats.org/officeDocument/2006/customXml" ds:itemID="{EF278816-EC6F-A645-907D-7F25AECB1D4A}">
+  <ds:schemaRefs/>
+</ds:datastoreItem>
+</file>
+
+<file path=docProps\app.xml><?xml version="1.0" encoding="utf-8"?>
+<Properties xmlns="http://schemas.openxmlformats.org/officeDocument/2006/extended-properties" xmlns:vt="http://schemas.openxmlformats.org/officeDocument/2006/docPropsVTypes">
+  <Template>Normal.dotm</Template>
+  <Pages>10</Pages>
+  <Words>1848</Words>
+  <Characters>10408</Characters>
+  <Lines>0</Lines>
+  <Paragraphs>0</Paragraphs>
+  <TotalTime>27</TotalTime>
+  <ScaleCrop>false</ScaleCrop>
+  <LinksUpToDate>false</LinksUpToDate>
+  <CharactersWithSpaces>11456</CharactersWithSpaces>
+  <Application>WPS Office_12.1.0.17468_F1E327BC-269C-435d-A152-05C5408002CA</Application>
+  <DocSecurity>0</DocSecurity>
+</Properties>
+</file>
+
+<file path=docProps\core.xml><?xml version="1.0" encoding="utf-8"?>
+<cp:coreProperties xmlns:cp="http://schemas.openxmlformats.org/package/2006/metadata/core-properties" xmlns:dc="http://purl.org/dc/elements/1.1/" xmlns:dcterms="http://purl.org/dc/terms/" xmlns:dcmitype="http://purl.org/dc/dcmitype/" xmlns:xsi="http://www.w3.org/2001/XMLSchema-instance">
+  <dcterms:created xsi:type="dcterms:W3CDTF">2013-12-23T23:15:00Z</dcterms:created>
+  <dc:creator>python-docx</dc:creator>
+  <dc:description>generated by python-docx</dc:description>
+  <cp:lastModifiedBy>企业用户_699494149</cp:lastModifiedBy>
+  <dcterms:modified xsi:type="dcterms:W3CDTF">2026-09-02T15:11:21Z</dcterms:modified>
+  <cp:revision>1</cp:revision>
+</cp:coreProperties>
+</file>
+
+<file path=docProps\custom.xml><?xml version="1.0" encoding="utf-8"?>
+<Properties xmlns="http://schemas.openxmlformats.org/officeDocument/2006/custom-properties" xmlns:vt="http://schemas.openxmlformats.org/officeDocument/2006/docPropsVTypes">
+  <property fmtid="{D5CDD505-2E9C-101B-9397-08002B2CF9AE}" pid="2" name="KSOProductBuildVer">
+    <vt:lpwstr>2052-12.1.0.17468</vt:lpwstr>
+  </property>
+  <property fmtid="{D5CDD505-2E9C-101B-9397-08002B2CF9AE}" pid="3" name="ICV">
+    <vt:lpwstr>4E0FB4AD71BD4C97B994AC8FABEEC127_12</vt:lpwstr>
+  </property>
+</Properties>
+</file>
+
+<file path=word\document.xml><?xml version="1.0" encoding="utf-8"?>
 <w:document xmlns:mc="http://schemas.openxmlformats.org/markup-compatibility/2006" xmlns:ns4="http://schemas.openxmlformats.org/drawingml/2006/main" xmlns:ns5="http://schemas.openxmlformats.org/drawingml/2006/picture" xmlns:ns7="http://schemas.microsoft.com/office/drawing/2016/SVG/main" xmlns:r="http://schemas.openxmlformats.org/officeDocument/2006/relationships" xmlns:w="http://schemas.openxmlformats.org/wordprocessingml/2006/main" xmlns:w14="http://schemas.microsoft.com/office/word/2010/wordml" xmlns:wp="http://schemas.openxmlformats.org/drawingml/2006/wordprocessingDrawing" mc:Ignorable="w14 w15 wp14">
   <w:body>
     <w:p>
@@ -816,6 +865,24 @@
                 <w:rFonts w:ascii="Calibri" w:hAnsi="Calibri"/>
                 <w:sz w:val="18"/>
               </w:rPr>
+              <w:t>21</w:t>
+            </w:r>
+          </w:p>
+        </w:tc>
+        <w:tc>
+          <w:tcPr>
+            <w:tcW w:w="1234" w:type="dxa"/>
+          </w:tcPr>
+          <w:p>
+            <w:pPr>
+              <w:spacing w:line="240" w:lineRule="auto"/>
+              <w:jc w:val="right"/>
+            </w:pPr>
+            <w:r>
+              <w:rPr>
+                <w:rFonts w:ascii="Calibri" w:hAnsi="Calibri"/>
+                <w:sz w:val="18"/>
+              </w:rPr>
               <w:t>18</w:t>
             </w:r>
           </w:p>
@@ -834,7 +901,7 @@
                 <w:rFonts w:ascii="Calibri" w:hAnsi="Calibri"/>
                 <w:sz w:val="18"/>
               </w:rPr>
-              <w:t>18</w:t>
+              <w:t>3</w:t>
             </w:r>
           </w:p>
         </w:tc>
@@ -852,25 +919,7 @@
                 <w:rFonts w:ascii="Calibri" w:hAnsi="Calibri"/>
                 <w:sz w:val="18"/>
               </w:rPr>
-              <w:t>0</w:t>
-            </w:r>
-          </w:p>
-        </w:tc>
-        <w:tc>
-          <w:tcPr>
-            <w:tcW w:w="1234" w:type="dxa"/>
-          </w:tcPr>
-          <w:p>
-            <w:pPr>
-              <w:spacing w:line="240" w:lineRule="auto"/>
-              <w:jc w:val="right"/>
-            </w:pPr>
-            <w:r>
-              <w:rPr>
-                <w:rFonts w:ascii="Calibri" w:hAnsi="Calibri"/>
-                <w:sz w:val="18"/>
-              </w:rPr>
-              <w:t>100.0%</w:t>
+              <w:t>85.7%</w:t>
             </w:r>
           </w:p>
         </w:tc>
@@ -1536,6 +1585,24 @@
                 <w:rFonts w:ascii="Calibri" w:hAnsi="Calibri"/>
                 <w:sz w:val="18"/>
               </w:rPr>
+              <w:t>98</w:t>
+            </w:r>
+          </w:p>
+        </w:tc>
+        <w:tc>
+          <w:tcPr>
+            <w:tcW w:w="1234" w:type="dxa"/>
+          </w:tcPr>
+          <w:p>
+            <w:pPr>
+              <w:spacing w:line="240" w:lineRule="auto"/>
+              <w:jc w:val="right"/>
+            </w:pPr>
+            <w:r>
+              <w:rPr>
+                <w:rFonts w:ascii="Calibri" w:hAnsi="Calibri"/>
+                <w:sz w:val="18"/>
+              </w:rPr>
               <w:t>84</w:t>
             </w:r>
           </w:p>
@@ -1554,7 +1621,7 @@
                 <w:rFonts w:ascii="Calibri" w:hAnsi="Calibri"/>
                 <w:sz w:val="18"/>
               </w:rPr>
-              <w:t>84</w:t>
+              <w:t>14</w:t>
             </w:r>
           </w:p>
         </w:tc>
@@ -1572,25 +1639,7 @@
                 <w:rFonts w:ascii="Calibri" w:hAnsi="Calibri"/>
                 <w:sz w:val="18"/>
               </w:rPr>
-              <w:t>0</w:t>
-            </w:r>
-          </w:p>
-        </w:tc>
-        <w:tc>
-          <w:tcPr>
-            <w:tcW w:w="1234" w:type="dxa"/>
-          </w:tcPr>
-          <w:p>
-            <w:pPr>
-              <w:spacing w:line="240" w:lineRule="auto"/>
-              <w:jc w:val="right"/>
-            </w:pPr>
-            <w:r>
-              <w:rPr>
-                <w:rFonts w:ascii="Calibri" w:hAnsi="Calibri"/>
-                <w:sz w:val="18"/>
-              </w:rPr>
-              <w:t>100.0%</w:t>
+              <w:t>85.7%</w:t>
             </w:r>
           </w:p>
         </w:tc>
@@ -1680,6 +1729,24 @@
                 <w:rFonts w:ascii="Calibri" w:hAnsi="Calibri"/>
                 <w:sz w:val="18"/>
               </w:rPr>
+              <w:t>161</w:t>
+            </w:r>
+          </w:p>
+        </w:tc>
+        <w:tc>
+          <w:tcPr>
+            <w:tcW w:w="1234" w:type="dxa"/>
+          </w:tcPr>
+          <w:p>
+            <w:pPr>
+              <w:spacing w:line="240" w:lineRule="auto"/>
+              <w:jc w:val="right"/>
+            </w:pPr>
+            <w:r>
+              <w:rPr>
+                <w:rFonts w:ascii="Calibri" w:hAnsi="Calibri"/>
+                <w:sz w:val="18"/>
+              </w:rPr>
               <w:t>130</w:t>
             </w:r>
           </w:p>
@@ -1698,7 +1765,7 @@
                 <w:rFonts w:ascii="Calibri" w:hAnsi="Calibri"/>
                 <w:sz w:val="18"/>
               </w:rPr>
-              <w:t>130</w:t>
+              <w:t>31</w:t>
             </w:r>
           </w:p>
         </w:tc>
@@ -1716,25 +1783,7 @@
                 <w:rFonts w:ascii="Calibri" w:hAnsi="Calibri"/>
                 <w:sz w:val="18"/>
               </w:rPr>
-              <w:t>0</w:t>
-            </w:r>
-          </w:p>
-        </w:tc>
-        <w:tc>
-          <w:tcPr>
-            <w:tcW w:w="1234" w:type="dxa"/>
-          </w:tcPr>
-          <w:p>
-            <w:pPr>
-              <w:spacing w:line="240" w:lineRule="auto"/>
-              <w:jc w:val="right"/>
-            </w:pPr>
-            <w:r>
-              <w:rPr>
-                <w:rFonts w:ascii="Calibri" w:hAnsi="Calibri"/>
-                <w:sz w:val="18"/>
-              </w:rPr>
-              <w:t>100.0%</w:t>
+              <w:t>80.7%</w:t>
             </w:r>
           </w:p>
         </w:tc>
@@ -2544,6 +2593,24 @@
                 <w:rFonts w:ascii="Calibri" w:hAnsi="Calibri"/>
                 <w:sz w:val="18"/>
               </w:rPr>
+              <w:t>255</w:t>
+            </w:r>
+          </w:p>
+        </w:tc>
+        <w:tc>
+          <w:tcPr>
+            <w:tcW w:w="1234" w:type="dxa"/>
+          </w:tcPr>
+          <w:p>
+            <w:pPr>
+              <w:spacing w:line="240" w:lineRule="auto"/>
+              <w:jc w:val="right"/>
+            </w:pPr>
+            <w:r>
+              <w:rPr>
+                <w:rFonts w:ascii="Calibri" w:hAnsi="Calibri"/>
+                <w:sz w:val="18"/>
+              </w:rPr>
               <w:t>224</w:t>
             </w:r>
           </w:p>
@@ -2562,7 +2629,7 @@
                 <w:rFonts w:ascii="Calibri" w:hAnsi="Calibri"/>
                 <w:sz w:val="18"/>
               </w:rPr>
-              <w:t>224</w:t>
+              <w:t>31</w:t>
             </w:r>
           </w:p>
         </w:tc>
@@ -2580,25 +2647,7 @@
                 <w:rFonts w:ascii="Calibri" w:hAnsi="Calibri"/>
                 <w:sz w:val="18"/>
               </w:rPr>
-              <w:t>0</w:t>
-            </w:r>
-          </w:p>
-        </w:tc>
-        <w:tc>
-          <w:tcPr>
-            <w:tcW w:w="1234" w:type="dxa"/>
-          </w:tcPr>
-          <w:p>
-            <w:pPr>
-              <w:spacing w:line="240" w:lineRule="auto"/>
-              <w:jc w:val="right"/>
-            </w:pPr>
-            <w:r>
-              <w:rPr>
-                <w:rFonts w:ascii="Calibri" w:hAnsi="Calibri"/>
-                <w:sz w:val="18"/>
-              </w:rPr>
-              <w:t>100.0%</w:t>
+              <w:t>87.8%</w:t>
             </w:r>
           </w:p>
         </w:tc>
@@ -2688,6 +2737,24 @@
                 <w:rFonts w:ascii="Calibri" w:hAnsi="Calibri"/>
                 <w:sz w:val="18"/>
               </w:rPr>
+              <w:t>90</w:t>
+            </w:r>
+          </w:p>
+        </w:tc>
+        <w:tc>
+          <w:tcPr>
+            <w:tcW w:w="1234" w:type="dxa"/>
+          </w:tcPr>
+          <w:p>
+            <w:pPr>
+              <w:spacing w:line="240" w:lineRule="auto"/>
+              <w:jc w:val="right"/>
+            </w:pPr>
+            <w:r>
+              <w:rPr>
+                <w:rFonts w:ascii="Calibri" w:hAnsi="Calibri"/>
+                <w:sz w:val="18"/>
+              </w:rPr>
               <w:t>79</w:t>
             </w:r>
           </w:p>
@@ -2706,7 +2773,7 @@
                 <w:rFonts w:ascii="Calibri" w:hAnsi="Calibri"/>
                 <w:sz w:val="18"/>
               </w:rPr>
-              <w:t>79</w:t>
+              <w:t>11</w:t>
             </w:r>
           </w:p>
         </w:tc>
@@ -2724,25 +2791,7 @@
                 <w:rFonts w:ascii="Calibri" w:hAnsi="Calibri"/>
                 <w:sz w:val="18"/>
               </w:rPr>
-              <w:t>0</w:t>
-            </w:r>
-          </w:p>
-        </w:tc>
-        <w:tc>
-          <w:tcPr>
-            <w:tcW w:w="1234" w:type="dxa"/>
-          </w:tcPr>
-          <w:p>
-            <w:pPr>
-              <w:spacing w:line="240" w:lineRule="auto"/>
-              <w:jc w:val="right"/>
-            </w:pPr>
-            <w:r>
-              <w:rPr>
-                <w:rFonts w:ascii="Calibri" w:hAnsi="Calibri"/>
-                <w:sz w:val="18"/>
-              </w:rPr>
-              <w:t>100.0%</w:t>
+              <w:t>87.8%</w:t>
             </w:r>
           </w:p>
         </w:tc>
@@ -2756,7 +2805,7 @@
           <w:i/>
           <w:sz w:val="20"/>
         </w:rPr>
-        <w:t>"In Dictionary" is the effective reference size used for evaluation. LSHTM-sourced codelists contain codes not present in the current CPRD Aurum dictionary version, which count as unreachable FN.</w:t>
+        <w:t>"In Dictionary" is the effective reference size used for evaluation. LSHTM-sourced codelists already use CPRD Aurum medcodeids but may contain codes not present in the current dictionary version. ClinicalCodes-sourced codelists use SNOMED codes and were matched to CPRD Aurum medcodeids/prodcodeids; unmatched codes count as Not in Dictionary. Codes not in the dictionary are unreachable and excluded from evaluation.</w:t>
       </w:r>
     </w:p>
     <w:p>
@@ -18761,7 +18810,7 @@
 </w:document>
 </file>
 
-<file path=word/endnotes.xml><?xml version="1.0" encoding="utf-8"?>
+<file path=word\endnotes.xml><?xml version="1.0" encoding="utf-8"?>
 <w:endnotes xmlns:wpc="http://schemas.microsoft.com/office/word/2010/wordprocessingCanvas" xmlns:mc="http://schemas.openxmlformats.org/markup-compatibility/2006" xmlns:o="urn:schemas-microsoft-com:office:office" xmlns:r="http://schemas.openxmlformats.org/officeDocument/2006/relationships" xmlns:m="http://schemas.openxmlformats.org/officeDocument/2006/math" xmlns:v="urn:schemas-microsoft-com:vml" xmlns:wp14="http://schemas.microsoft.com/office/word/2010/wordprocessingDrawing" xmlns:wp="http://schemas.openxmlformats.org/drawingml/2006/wordprocessingDrawing" xmlns:w="http://schemas.openxmlformats.org/wordprocessingml/2006/main" xmlns:w14="http://schemas.microsoft.com/office/word/2010/wordml" xmlns:w15="http://schemas.microsoft.com/office/word/2012/wordml" xmlns:w10="urn:schemas-microsoft-com:office:word" xmlns:wpg="http://schemas.microsoft.com/office/word/2010/wordprocessingGroup" xmlns:wpi="http://schemas.microsoft.com/office/word/2010/wordprocessingInk" xmlns:wne="http://schemas.microsoft.com/office/word/2006/wordml" xmlns:wps="http://schemas.microsoft.com/office/word/2010/wordprocessingShape" xmlns:wpsCustomData="http://www.wps.cn/officeDocument/2013/wpsCustomData" mc:Ignorable="w14 w15 wp14">
   <w:endnote w:type="separator" w:id="0">
     <w:p>
@@ -18786,7 +18835,128 @@
 </w:endnotes>
 </file>
 
-<file path=word/footnotes.xml><?xml version="1.0" encoding="utf-8"?>
+<file path=word\fontTable.xml><?xml version="1.0" encoding="utf-8"?>
+<w:fonts xmlns:mc="http://schemas.openxmlformats.org/markup-compatibility/2006" xmlns:r="http://schemas.openxmlformats.org/officeDocument/2006/relationships" xmlns:w="http://schemas.openxmlformats.org/wordprocessingml/2006/main" xmlns:w14="http://schemas.microsoft.com/office/word/2010/wordml" mc:Ignorable="w14">
+  <w:font w:name="Times New Roman">
+    <w:panose1 w:val="02020603050405020304"/>
+    <w:charset w:val="00"/>
+    <w:family w:val="roman"/>
+    <w:pitch w:val="variable"/>
+    <w:sig w:usb0="20007A87" w:usb1="80000000" w:usb2="00000008" w:usb3="00000000" w:csb0="000001FF" w:csb1="00000000"/>
+  </w:font>
+  <w:font w:name="宋体">
+    <w:panose1 w:val="02010600030101010101"/>
+    <w:charset w:val="86"/>
+    <w:family w:val="auto"/>
+    <w:pitch w:val="default"/>
+    <w:sig w:usb0="00000203" w:usb1="288F0000" w:usb2="00000006" w:usb3="00000000" w:csb0="00040001" w:csb1="00000000"/>
+  </w:font>
+  <w:font w:name="Wingdings">
+    <w:panose1 w:val="05000000000000000000"/>
+    <w:charset w:val="02"/>
+    <w:family w:val="auto"/>
+    <w:pitch w:val="default"/>
+    <w:sig w:usb0="00000000" w:usb1="00000000" w:usb2="00000000" w:usb3="00000000" w:csb0="80000000" w:csb1="00000000"/>
+  </w:font>
+  <w:font w:name="Arial">
+    <w:panose1 w:val="020B0604020202020204"/>
+    <w:charset w:val="01"/>
+    <w:family w:val="swiss"/>
+    <w:pitch w:val="default"/>
+    <w:sig w:usb0="E0002EFF" w:usb1="C000785B" w:usb2="00000009" w:usb3="00000000" w:csb0="400001FF" w:csb1="FFFF0000"/>
+  </w:font>
+  <w:font w:name="黑体">
+    <w:panose1 w:val="02010609060101010101"/>
+    <w:charset w:val="86"/>
+    <w:family w:val="auto"/>
+    <w:pitch w:val="default"/>
+    <w:sig w:usb0="800002BF" w:usb1="38CF7CFA" w:usb2="00000016" w:usb3="00000000" w:csb0="00040001" w:csb1="00000000"/>
+  </w:font>
+  <w:font w:name="Courier New">
+    <w:panose1 w:val="02070309020205020404"/>
+    <w:charset w:val="01"/>
+    <w:family w:val="modern"/>
+    <w:pitch w:val="default"/>
+    <w:sig w:usb0="E0002EFF" w:usb1="C0007843" w:usb2="00000009" w:usb3="00000000" w:csb0="400001FF" w:csb1="FFFF0000"/>
+  </w:font>
+  <w:font w:name="Symbol">
+    <w:panose1 w:val="05050102010706020507"/>
+    <w:charset w:val="02"/>
+    <w:family w:val="roman"/>
+    <w:pitch w:val="default"/>
+    <w:sig w:usb0="00000000" w:usb1="00000000" w:usb2="00000000" w:usb3="00000000" w:csb0="80000000" w:csb1="00000000"/>
+  </w:font>
+  <w:font w:name="Calibri">
+    <w:panose1 w:val="020F0502020204030204"/>
+    <w:charset w:val="00"/>
+    <w:family w:val="swiss"/>
+    <w:pitch w:val="default"/>
+    <w:sig w:usb0="E4002EFF" w:usb1="C200247B" w:usb2="00000009" w:usb3="00000000" w:csb0="200001FF" w:csb1="00000000"/>
+  </w:font>
+  <w:font w:name="Cambria">
+    <w:panose1 w:val="02040503050406030204"/>
+    <w:charset w:val="00"/>
+    <w:family w:val="auto"/>
+    <w:pitch w:val="default"/>
+    <w:sig w:usb0="E00006FF" w:usb1="420024FF" w:usb2="02000000" w:usb3="00000000" w:csb0="2000019F" w:csb1="00000000"/>
+  </w:font>
+  <w:font w:name="ＭＳ 明朝">
+    <w:altName w:val="Yu Gothic"/>
+    <w:panose1 w:val="00000000000000000000"/>
+    <w:charset w:val="80"/>
+    <w:family w:val="roman"/>
+    <w:pitch w:val="default"/>
+    <w:sig w:usb0="00000000" w:usb1="00000000" w:usb2="00000010" w:usb3="00000000" w:csb0="00020000" w:csb1="00000000"/>
+  </w:font>
+  <w:font w:name="ＭＳ 明朝">
+    <w:altName w:val="宋体"/>
+    <w:panose1 w:val="00000000000000000000"/>
+    <w:charset w:val="86"/>
+    <w:family w:val="auto"/>
+    <w:pitch w:val="default"/>
+    <w:sig w:usb0="00000000" w:usb1="00000000" w:usb2="00000000" w:usb3="00000000" w:csb0="00000000" w:csb1="00000000"/>
+  </w:font>
+  <w:font w:name="MS Gothic">
+    <w:panose1 w:val="020B0609070205080204"/>
+    <w:charset w:val="80"/>
+    <w:family w:val="auto"/>
+    <w:pitch w:val="default"/>
+    <w:sig w:usb0="E00002FF" w:usb1="6AC7FDFB" w:usb2="08000012" w:usb3="00000000" w:csb0="4002009F" w:csb1="DFD70000"/>
+  </w:font>
+  <w:font w:name="Courier">
+    <w:altName w:val="Courier New"/>
+    <w:panose1 w:val="02000500000000000000"/>
+    <w:charset w:val="00"/>
+    <w:family w:val="auto"/>
+    <w:pitch w:val="default"/>
+    <w:sig w:usb0="00000000" w:usb1="00000000" w:usb2="00000000" w:usb3="00000000" w:csb0="00000001" w:csb1="00000000"/>
+  </w:font>
+  <w:font w:name="ＭＳ 明朝">
+    <w:altName w:val="Segoe Print"/>
+    <w:panose1 w:val="00000000000000000000"/>
+    <w:charset w:val="00"/>
+    <w:family w:val="auto"/>
+    <w:pitch w:val="default"/>
+    <w:sig w:usb0="00000000" w:usb1="00000000" w:usb2="00000000" w:usb3="00000000" w:csb0="00000000" w:csb1="00000000"/>
+  </w:font>
+  <w:font w:name="Segoe Print">
+    <w:panose1 w:val="02000600000000000000"/>
+    <w:charset w:val="00"/>
+    <w:family w:val="auto"/>
+    <w:pitch w:val="default"/>
+    <w:sig w:usb0="0000028F" w:usb1="00000000" w:usb2="00000000" w:usb3="00000000" w:csb0="2000009F" w:csb1="47010000"/>
+  </w:font>
+  <w:font w:name="Yu Gothic">
+    <w:panose1 w:val="020B0400000000000000"/>
+    <w:charset w:val="80"/>
+    <w:family w:val="auto"/>
+    <w:pitch w:val="default"/>
+    <w:sig w:usb0="E00002FF" w:usb1="2AC7FDFF" w:usb2="00000016" w:usb3="00000000" w:csb0="2002009F" w:csb1="00000000"/>
+  </w:font>
+</w:fonts>
+</file>
+
+<file path=word\footnotes.xml><?xml version="1.0" encoding="utf-8"?>
 <w:footnotes xmlns:wpc="http://schemas.microsoft.com/office/word/2010/wordprocessingCanvas" xmlns:mc="http://schemas.openxmlformats.org/markup-compatibility/2006" xmlns:o="urn:schemas-microsoft-com:office:office" xmlns:r="http://schemas.openxmlformats.org/officeDocument/2006/relationships" xmlns:m="http://schemas.openxmlformats.org/officeDocument/2006/math" xmlns:v="urn:schemas-microsoft-com:vml" xmlns:wp14="http://schemas.microsoft.com/office/word/2010/wordprocessingDrawing" xmlns:wp="http://schemas.openxmlformats.org/drawingml/2006/wordprocessingDrawing" xmlns:w="http://schemas.openxmlformats.org/wordprocessingml/2006/main" xmlns:w14="http://schemas.microsoft.com/office/word/2010/wordml" xmlns:w15="http://schemas.microsoft.com/office/word/2012/wordml" xmlns:w10="urn:schemas-microsoft-com:office:word" xmlns:wpg="http://schemas.microsoft.com/office/word/2010/wordprocessingGroup" xmlns:wpi="http://schemas.microsoft.com/office/word/2010/wordprocessingInk" xmlns:wne="http://schemas.microsoft.com/office/word/2006/wordml" xmlns:wps="http://schemas.microsoft.com/office/word/2010/wordprocessingShape" xmlns:wpsCustomData="http://www.wps.cn/officeDocument/2013/wpsCustomData" mc:Ignorable="w14 w15 wp14">
   <w:footnote w:type="separator" w:id="0">
     <w:p>
@@ -18811,7 +18981,7 @@
 </w:footnotes>
 </file>
 
-<file path=word/numbering.xml><?xml version="1.0" encoding="utf-8"?>
+<file path=word\numbering.xml><?xml version="1.0" encoding="utf-8"?>
 <w:numbering xmlns:wpc="http://schemas.microsoft.com/office/word/2010/wordprocessingCanvas" xmlns:mc="http://schemas.openxmlformats.org/markup-compatibility/2006" xmlns:o="urn:schemas-microsoft-com:office:office" xmlns:r="http://schemas.openxmlformats.org/officeDocument/2006/relationships" xmlns:m="http://schemas.openxmlformats.org/officeDocument/2006/math" xmlns:v="urn:schemas-microsoft-com:vml" xmlns:wp14="http://schemas.microsoft.com/office/word/2010/wordprocessingDrawing" xmlns:wp="http://schemas.openxmlformats.org/drawingml/2006/wordprocessingDrawing" xmlns:w10="urn:schemas-microsoft-com:office:word" xmlns:w="http://schemas.openxmlformats.org/wordprocessingml/2006/main" xmlns:w14="http://schemas.microsoft.com/office/word/2010/wordml" xmlns:wpg="http://schemas.microsoft.com/office/word/2010/wordprocessingGroup" xmlns:wpi="http://schemas.microsoft.com/office/word/2010/wordprocessingInk" xmlns:wne="http://schemas.microsoft.com/office/word/2006/wordml" xmlns:wps="http://schemas.microsoft.com/office/word/2010/wordprocessingShape" xmlns:wpsCustomData="http://www.wps.cn/officeDocument/2013/wpsCustomData" mc:Ignorable="w14 wp14">
   <w:abstractNum w:abstractNumId="0">
     <w:nsid w:val="FFFFFF7E"/>
@@ -18951,7 +19121,68 @@
 </w:numbering>
 </file>
 
-<file path=word/styles.xml><?xml version="1.0" encoding="utf-8"?>
+<file path=word\settings.xml><?xml version="1.0" encoding="utf-8"?>
+<w:settings xmlns:mc="http://schemas.openxmlformats.org/markup-compatibility/2006" xmlns:o="urn:schemas-microsoft-com:office:office" xmlns:r="http://schemas.openxmlformats.org/officeDocument/2006/relationships" xmlns:m="http://schemas.openxmlformats.org/officeDocument/2006/math" xmlns:v="urn:schemas-microsoft-com:vml" xmlns:w10="urn:schemas-microsoft-com:office:word" xmlns:w="http://schemas.openxmlformats.org/wordprocessingml/2006/main" xmlns:w14="http://schemas.microsoft.com/office/word/2010/wordml" xmlns:sl="http://schemas.openxmlformats.org/schemaLibrary/2006/main" xmlns:wpsCustomData="http://www.wps.cn/officeDocument/2013/wpsCustomData" mc:Ignorable="w14">
+  <w:zoom w:percent="120"/>
+  <w:documentProtection w:enforcement="0"/>
+  <w:defaultTabStop w:val="720"/>
+  <w:characterSpacingControl w:val="doNotCompress"/>
+  <w:footnotePr>
+    <w:footnote w:id="0"/>
+    <w:footnote w:id="1"/>
+  </w:footnotePr>
+  <w:endnotePr>
+    <w:endnote w:id="0"/>
+    <w:endnote w:id="1"/>
+  </w:endnotePr>
+  <w:compat>
+    <w:useFELayout/>
+    <w:compatSetting w:name="compatibilityMode" w:uri="http://schemas.microsoft.com/office/word" w:val="14"/>
+    <w:compatSetting w:name="overrideTableStyleFontSizeAndJustification" w:uri="http://schemas.microsoft.com/office/word" w:val="1"/>
+    <w:compatSetting w:name="enableOpenTypeFeatures" w:uri="http://schemas.microsoft.com/office/word" w:val="1"/>
+    <w:compatSetting w:name="doNotFlipMirrorIndents" w:uri="http://schemas.microsoft.com/office/word" w:val="1"/>
+  </w:compat>
+  <w:docVars>
+    <w:docVar w:name="commondata" w:val="eyJoZGlkIjoiNmNjZTM1MDFjMzExNDU2NzczODQ3N2YzYWY2MmYxMWEifQ=="/>
+  </w:docVars>
+  <w:rsids>
+    <w:rsidRoot w:val="00B47730"/>
+    <w:rsid w:val="00034616"/>
+    <w:rsid w:val="0006063C"/>
+    <w:rsid w:val="0015074B"/>
+    <w:rsid w:val="001A1040"/>
+    <w:rsid w:val="0029639D"/>
+    <w:rsid w:val="00326F90"/>
+    <w:rsid w:val="00AA1D8D"/>
+    <w:rsid w:val="00B47730"/>
+    <w:rsid w:val="00CB0664"/>
+    <w:rsid w:val="00FC693F"/>
+    <w:rsid w:val="3939646D"/>
+    <w:rsid w:val="3B054327"/>
+    <w:rsid w:val="3B3457CF"/>
+    <w:rsid w:val="3C4B37F1"/>
+  </w:rsids>
+  <m:mathPr>
+    <m:mathFont m:val="Cambria Math"/>
+    <m:brkBin m:val="before"/>
+    <m:brkBinSub m:val="--"/>
+    <m:smallFrac m:val="0"/>
+    <m:dispDef/>
+    <m:lMargin m:val="0"/>
+    <m:rMargin m:val="0"/>
+    <m:defJc m:val="centerGroup"/>
+    <m:wrapIndent m:val="1440"/>
+    <m:intLim m:val="subSup"/>
+    <m:naryLim m:val="undOvr"/>
+  </m:mathPr>
+  <w:doNotAutoCompressPictures/>
+  <w:themeFontLang w:val="en-US" w:eastAsia="ja-JP"/>
+  <w:clrSchemeMapping w:bg1="light1" w:t1="dark1" w:bg2="light2" w:t2="dark2" w:accent1="accent1" w:accent2="accent2" w:accent3="accent3" w:accent4="accent4" w:accent5="accent5" w:accent6="accent6" w:hyperlink="hyperlink" w:followedHyperlink="followedHyperlink"/>
+  <w14:defaultImageDpi w14:val="300"/>
+</w:settings>
+</file>
+
+<file path=word\styles.xml><?xml version="1.0" encoding="utf-8"?>
 <w:styles xmlns:mc="http://schemas.openxmlformats.org/markup-compatibility/2006" xmlns:o="urn:schemas-microsoft-com:office:office" xmlns:r="http://schemas.openxmlformats.org/officeDocument/2006/relationships" xmlns:m="http://schemas.openxmlformats.org/officeDocument/2006/math" xmlns:v="urn:schemas-microsoft-com:vml" xmlns:w="http://schemas.openxmlformats.org/wordprocessingml/2006/main" xmlns:w14="http://schemas.microsoft.com/office/word/2010/wordml" xmlns:w10="urn:schemas-microsoft-com:office:word" xmlns:sl="http://schemas.openxmlformats.org/schemaLibrary/2006/main" xmlns:wpsCustomData="http://www.wps.cn/officeDocument/2013/wpsCustomData" mc:Ignorable="w14">
   <w:docDefaults>
     <w:rPrDefault>
@@ -31788,7 +32019,7 @@
 </w:styles>
 </file>
 
-<file path=word/theme/theme1.xml><?xml version="1.0" encoding="utf-8"?>
+<file path=word\theme\theme1.xml><?xml version="1.0" encoding="utf-8"?>
 <a:theme xmlns:a="http://schemas.openxmlformats.org/drawingml/2006/main" name="Office Theme">
   <a:themeElements>
     <a:clrScheme name="Office">
@@ -32105,14 +32336,4 @@
     </a:lnDef>
   </a:objectDefaults>
 </a:theme>
-</file>
-
-<file path=customXml/item1.xml><?xml version="1.0" encoding="utf-8"?>
-<b:Sources xmlns:b="http://schemas.openxmlformats.org/officeDocument/2006/bibliography" xmlns="http://schemas.openxmlformats.org/officeDocument/2006/bibliography" SelectedStyle="/APA.XSL" StyleName="APA"/>
-</file>
-
-<file path=customXml/itemProps1.xml><?xml version="1.0" encoding="utf-8"?>
-<ds:datastoreItem xmlns:ds="http://schemas.openxmlformats.org/officeDocument/2006/customXml" ds:itemID="{EF278816-EC6F-A645-907D-7F25AECB1D4A}">
-  <ds:schemaRefs/>
-</ds:datastoreItem>
 </file>
</xml_diff>

<commit_message>
Remove Jaccard from main analysis tables
- Remove Jaccard column from Table 2 (main results) and model summary
- Jaccard retained only for AF inter-expert (Table 3) and AI vs expert (Table 4)
- Updated both .md and .docx

Co-Authored-By: Claude Opus 4.6 <noreply@anthropic.com>
</commit_message>
<xml_diff>
--- a/dissertation_data_summary.docx
+++ b/dissertation_data_summary.docx
@@ -3179,26 +3179,6 @@
             </w:r>
           </w:p>
         </w:tc>
-        <w:tc>
-          <w:tcPr>
-            <w:tcW w:w="960" w:type="dxa"/>
-            <w:shd w:val="clear" w:color="auto" w:fill="D9E2F3"/>
-          </w:tcPr>
-          <w:p>
-            <w:pPr>
-              <w:spacing w:line="240" w:lineRule="auto"/>
-              <w:jc w:val="center"/>
-            </w:pPr>
-            <w:r>
-              <w:rPr>
-                <w:rFonts w:ascii="Calibri" w:hAnsi="Calibri"/>
-                <w:b/>
-                <w:sz w:val="18"/>
-              </w:rPr>
-              <w:t>Jaccard</w:t>
-            </w:r>
-          </w:p>
-        </w:tc>
       </w:tr>
       <w:tr>
         <w:tblPrEx>
@@ -3362,24 +3342,6 @@
             </w:r>
           </w:p>
         </w:tc>
-        <w:tc>
-          <w:tcPr>
-            <w:tcW w:w="960" w:type="dxa"/>
-          </w:tcPr>
-          <w:p>
-            <w:pPr>
-              <w:spacing w:line="240" w:lineRule="auto"/>
-              <w:jc w:val="right"/>
-            </w:pPr>
-            <w:r>
-              <w:rPr>
-                <w:rFonts w:ascii="Calibri" w:hAnsi="Calibri"/>
-                <w:sz w:val="18"/>
-              </w:rPr>
-              <w:t>0.333</w:t>
-            </w:r>
-          </w:p>
-        </w:tc>
       </w:tr>
       <w:tr>
         <w:tblPrEx>
@@ -3536,24 +3498,6 @@
             </w:r>
           </w:p>
         </w:tc>
-        <w:tc>
-          <w:tcPr>
-            <w:tcW w:w="960" w:type="dxa"/>
-          </w:tcPr>
-          <w:p>
-            <w:pPr>
-              <w:spacing w:line="240" w:lineRule="auto"/>
-              <w:jc w:val="right"/>
-            </w:pPr>
-            <w:r>
-              <w:rPr>
-                <w:rFonts w:ascii="Calibri" w:hAnsi="Calibri"/>
-                <w:sz w:val="18"/>
-              </w:rPr>
-              <w:t>0.457</w:t>
-            </w:r>
-          </w:p>
-        </w:tc>
       </w:tr>
       <w:tr>
         <w:tblPrEx>
@@ -3710,24 +3654,6 @@
             </w:r>
           </w:p>
         </w:tc>
-        <w:tc>
-          <w:tcPr>
-            <w:tcW w:w="960" w:type="dxa"/>
-          </w:tcPr>
-          <w:p>
-            <w:pPr>
-              <w:spacing w:line="240" w:lineRule="auto"/>
-              <w:jc w:val="right"/>
-            </w:pPr>
-            <w:r>
-              <w:rPr>
-                <w:rFonts w:ascii="Calibri" w:hAnsi="Calibri"/>
-                <w:sz w:val="18"/>
-              </w:rPr>
-              <w:t>0.485</w:t>
-            </w:r>
-          </w:p>
-        </w:tc>
       </w:tr>
       <w:tr>
         <w:tblPrEx>
@@ -3891,24 +3817,6 @@
             </w:r>
           </w:p>
         </w:tc>
-        <w:tc>
-          <w:tcPr>
-            <w:tcW w:w="960" w:type="dxa"/>
-          </w:tcPr>
-          <w:p>
-            <w:pPr>
-              <w:spacing w:line="240" w:lineRule="auto"/>
-              <w:jc w:val="right"/>
-            </w:pPr>
-            <w:r>
-              <w:rPr>
-                <w:rFonts w:ascii="Calibri" w:hAnsi="Calibri"/>
-                <w:sz w:val="18"/>
-              </w:rPr>
-              <w:t>0.167</w:t>
-            </w:r>
-          </w:p>
-        </w:tc>
       </w:tr>
       <w:tr>
         <w:tblPrEx>
@@ -4065,24 +3973,6 @@
             </w:r>
           </w:p>
         </w:tc>
-        <w:tc>
-          <w:tcPr>
-            <w:tcW w:w="960" w:type="dxa"/>
-          </w:tcPr>
-          <w:p>
-            <w:pPr>
-              <w:spacing w:line="240" w:lineRule="auto"/>
-              <w:jc w:val="right"/>
-            </w:pPr>
-            <w:r>
-              <w:rPr>
-                <w:rFonts w:ascii="Calibri" w:hAnsi="Calibri"/>
-                <w:sz w:val="18"/>
-              </w:rPr>
-              <w:t>0.162</w:t>
-            </w:r>
-          </w:p>
-        </w:tc>
       </w:tr>
       <w:tr>
         <w:tblPrEx>
@@ -4239,24 +4129,6 @@
             </w:r>
           </w:p>
         </w:tc>
-        <w:tc>
-          <w:tcPr>
-            <w:tcW w:w="960" w:type="dxa"/>
-          </w:tcPr>
-          <w:p>
-            <w:pPr>
-              <w:spacing w:line="240" w:lineRule="auto"/>
-              <w:jc w:val="right"/>
-            </w:pPr>
-            <w:r>
-              <w:rPr>
-                <w:rFonts w:ascii="Calibri" w:hAnsi="Calibri"/>
-                <w:sz w:val="18"/>
-              </w:rPr>
-              <w:t>0.188</w:t>
-            </w:r>
-          </w:p>
-        </w:tc>
       </w:tr>
       <w:tr>
         <w:tblPrEx>
@@ -4420,24 +4292,6 @@
             </w:r>
           </w:p>
         </w:tc>
-        <w:tc>
-          <w:tcPr>
-            <w:tcW w:w="960" w:type="dxa"/>
-          </w:tcPr>
-          <w:p>
-            <w:pPr>
-              <w:spacing w:line="240" w:lineRule="auto"/>
-              <w:jc w:val="right"/>
-            </w:pPr>
-            <w:r>
-              <w:rPr>
-                <w:rFonts w:ascii="Calibri" w:hAnsi="Calibri"/>
-                <w:sz w:val="18"/>
-              </w:rPr>
-              <w:t>0.151</w:t>
-            </w:r>
-          </w:p>
-        </w:tc>
       </w:tr>
       <w:tr>
         <w:tblPrEx>
@@ -4594,24 +4448,6 @@
             </w:r>
           </w:p>
         </w:tc>
-        <w:tc>
-          <w:tcPr>
-            <w:tcW w:w="960" w:type="dxa"/>
-          </w:tcPr>
-          <w:p>
-            <w:pPr>
-              <w:spacing w:line="240" w:lineRule="auto"/>
-              <w:jc w:val="right"/>
-            </w:pPr>
-            <w:r>
-              <w:rPr>
-                <w:rFonts w:ascii="Calibri" w:hAnsi="Calibri"/>
-                <w:sz w:val="18"/>
-              </w:rPr>
-              <w:t>0.149</w:t>
-            </w:r>
-          </w:p>
-        </w:tc>
       </w:tr>
       <w:tr>
         <w:tblPrEx>
@@ -4768,24 +4604,6 @@
             </w:r>
           </w:p>
         </w:tc>
-        <w:tc>
-          <w:tcPr>
-            <w:tcW w:w="960" w:type="dxa"/>
-          </w:tcPr>
-          <w:p>
-            <w:pPr>
-              <w:spacing w:line="240" w:lineRule="auto"/>
-              <w:jc w:val="right"/>
-            </w:pPr>
-            <w:r>
-              <w:rPr>
-                <w:rFonts w:ascii="Calibri" w:hAnsi="Calibri"/>
-                <w:sz w:val="18"/>
-              </w:rPr>
-              <w:t>0.133</w:t>
-            </w:r>
-          </w:p>
-        </w:tc>
       </w:tr>
       <w:tr>
         <w:tblPrEx>
@@ -4949,24 +4767,6 @@
             </w:r>
           </w:p>
         </w:tc>
-        <w:tc>
-          <w:tcPr>
-            <w:tcW w:w="960" w:type="dxa"/>
-          </w:tcPr>
-          <w:p>
-            <w:pPr>
-              <w:spacing w:line="240" w:lineRule="auto"/>
-              <w:jc w:val="right"/>
-            </w:pPr>
-            <w:r>
-              <w:rPr>
-                <w:rFonts w:ascii="Calibri" w:hAnsi="Calibri"/>
-                <w:sz w:val="18"/>
-              </w:rPr>
-              <w:t>0.232</w:t>
-            </w:r>
-          </w:p>
-        </w:tc>
       </w:tr>
       <w:tr>
         <w:tblPrEx>
@@ -5123,24 +4923,6 @@
             </w:r>
           </w:p>
         </w:tc>
-        <w:tc>
-          <w:tcPr>
-            <w:tcW w:w="960" w:type="dxa"/>
-          </w:tcPr>
-          <w:p>
-            <w:pPr>
-              <w:spacing w:line="240" w:lineRule="auto"/>
-              <w:jc w:val="right"/>
-            </w:pPr>
-            <w:r>
-              <w:rPr>
-                <w:rFonts w:ascii="Calibri" w:hAnsi="Calibri"/>
-                <w:sz w:val="18"/>
-              </w:rPr>
-              <w:t>0.320</w:t>
-            </w:r>
-          </w:p>
-        </w:tc>
       </w:tr>
       <w:tr>
         <w:tblPrEx>
@@ -5297,24 +5079,6 @@
             </w:r>
           </w:p>
         </w:tc>
-        <w:tc>
-          <w:tcPr>
-            <w:tcW w:w="960" w:type="dxa"/>
-          </w:tcPr>
-          <w:p>
-            <w:pPr>
-              <w:spacing w:line="240" w:lineRule="auto"/>
-              <w:jc w:val="right"/>
-            </w:pPr>
-            <w:r>
-              <w:rPr>
-                <w:rFonts w:ascii="Calibri" w:hAnsi="Calibri"/>
-                <w:sz w:val="18"/>
-              </w:rPr>
-              <w:t>0.340</w:t>
-            </w:r>
-          </w:p>
-        </w:tc>
       </w:tr>
       <w:tr>
         <w:tblPrEx>
@@ -5478,24 +5242,6 @@
             </w:r>
           </w:p>
         </w:tc>
-        <w:tc>
-          <w:tcPr>
-            <w:tcW w:w="960" w:type="dxa"/>
-          </w:tcPr>
-          <w:p>
-            <w:pPr>
-              <w:spacing w:line="240" w:lineRule="auto"/>
-              <w:jc w:val="right"/>
-            </w:pPr>
-            <w:r>
-              <w:rPr>
-                <w:rFonts w:ascii="Calibri" w:hAnsi="Calibri"/>
-                <w:sz w:val="18"/>
-              </w:rPr>
-              <w:t>0.280</w:t>
-            </w:r>
-          </w:p>
-        </w:tc>
       </w:tr>
       <w:tr>
         <w:tblPrEx>
@@ -5652,24 +5398,6 @@
             </w:r>
           </w:p>
         </w:tc>
-        <w:tc>
-          <w:tcPr>
-            <w:tcW w:w="960" w:type="dxa"/>
-          </w:tcPr>
-          <w:p>
-            <w:pPr>
-              <w:spacing w:line="240" w:lineRule="auto"/>
-              <w:jc w:val="right"/>
-            </w:pPr>
-            <w:r>
-              <w:rPr>
-                <w:rFonts w:ascii="Calibri" w:hAnsi="Calibri"/>
-                <w:sz w:val="18"/>
-              </w:rPr>
-              <w:t>0.265</w:t>
-            </w:r>
-          </w:p>
-        </w:tc>
       </w:tr>
       <w:tr>
         <w:tblPrEx>
@@ -5826,24 +5554,6 @@
             </w:r>
           </w:p>
         </w:tc>
-        <w:tc>
-          <w:tcPr>
-            <w:tcW w:w="960" w:type="dxa"/>
-          </w:tcPr>
-          <w:p>
-            <w:pPr>
-              <w:spacing w:line="240" w:lineRule="auto"/>
-              <w:jc w:val="right"/>
-            </w:pPr>
-            <w:r>
-              <w:rPr>
-                <w:rFonts w:ascii="Calibri" w:hAnsi="Calibri"/>
-                <w:sz w:val="18"/>
-              </w:rPr>
-              <w:t>0.348</w:t>
-            </w:r>
-          </w:p>
-        </w:tc>
       </w:tr>
       <w:tr>
         <w:tblPrEx>
@@ -6007,24 +5717,6 @@
             </w:r>
           </w:p>
         </w:tc>
-        <w:tc>
-          <w:tcPr>
-            <w:tcW w:w="960" w:type="dxa"/>
-          </w:tcPr>
-          <w:p>
-            <w:pPr>
-              <w:spacing w:line="240" w:lineRule="auto"/>
-              <w:jc w:val="right"/>
-            </w:pPr>
-            <w:r>
-              <w:rPr>
-                <w:rFonts w:ascii="Calibri" w:hAnsi="Calibri"/>
-                <w:sz w:val="18"/>
-              </w:rPr>
-              <w:t>0.042</w:t>
-            </w:r>
-          </w:p>
-        </w:tc>
       </w:tr>
       <w:tr>
         <w:tblPrEx>
@@ -6181,24 +5873,6 @@
             </w:r>
           </w:p>
         </w:tc>
-        <w:tc>
-          <w:tcPr>
-            <w:tcW w:w="960" w:type="dxa"/>
-          </w:tcPr>
-          <w:p>
-            <w:pPr>
-              <w:spacing w:line="240" w:lineRule="auto"/>
-              <w:jc w:val="right"/>
-            </w:pPr>
-            <w:r>
-              <w:rPr>
-                <w:rFonts w:ascii="Calibri" w:hAnsi="Calibri"/>
-                <w:sz w:val="18"/>
-              </w:rPr>
-              <w:t>0.099</w:t>
-            </w:r>
-          </w:p>
-        </w:tc>
       </w:tr>
       <w:tr>
         <w:tblPrEx>
@@ -6355,24 +6029,6 @@
             </w:r>
           </w:p>
         </w:tc>
-        <w:tc>
-          <w:tcPr>
-            <w:tcW w:w="960" w:type="dxa"/>
-          </w:tcPr>
-          <w:p>
-            <w:pPr>
-              <w:spacing w:line="240" w:lineRule="auto"/>
-              <w:jc w:val="right"/>
-            </w:pPr>
-            <w:r>
-              <w:rPr>
-                <w:rFonts w:ascii="Calibri" w:hAnsi="Calibri"/>
-                <w:sz w:val="18"/>
-              </w:rPr>
-              <w:t>0.092</w:t>
-            </w:r>
-          </w:p>
-        </w:tc>
       </w:tr>
       <w:tr>
         <w:tblPrEx>
@@ -6536,24 +6192,6 @@
             </w:r>
           </w:p>
         </w:tc>
-        <w:tc>
-          <w:tcPr>
-            <w:tcW w:w="960" w:type="dxa"/>
-          </w:tcPr>
-          <w:p>
-            <w:pPr>
-              <w:spacing w:line="240" w:lineRule="auto"/>
-              <w:jc w:val="right"/>
-            </w:pPr>
-            <w:r>
-              <w:rPr>
-                <w:rFonts w:ascii="Calibri" w:hAnsi="Calibri"/>
-                <w:sz w:val="18"/>
-              </w:rPr>
-              <w:t>0.218</w:t>
-            </w:r>
-          </w:p>
-        </w:tc>
       </w:tr>
       <w:tr>
         <w:tblPrEx>
@@ -6710,24 +6348,6 @@
             </w:r>
           </w:p>
         </w:tc>
-        <w:tc>
-          <w:tcPr>
-            <w:tcW w:w="960" w:type="dxa"/>
-          </w:tcPr>
-          <w:p>
-            <w:pPr>
-              <w:spacing w:line="240" w:lineRule="auto"/>
-              <w:jc w:val="right"/>
-            </w:pPr>
-            <w:r>
-              <w:rPr>
-                <w:rFonts w:ascii="Calibri" w:hAnsi="Calibri"/>
-                <w:sz w:val="18"/>
-              </w:rPr>
-              <w:t>0.302</w:t>
-            </w:r>
-          </w:p>
-        </w:tc>
       </w:tr>
       <w:tr>
         <w:tblPrEx>
@@ -6884,24 +6504,6 @@
             </w:r>
           </w:p>
         </w:tc>
-        <w:tc>
-          <w:tcPr>
-            <w:tcW w:w="960" w:type="dxa"/>
-          </w:tcPr>
-          <w:p>
-            <w:pPr>
-              <w:spacing w:line="240" w:lineRule="auto"/>
-              <w:jc w:val="right"/>
-            </w:pPr>
-            <w:r>
-              <w:rPr>
-                <w:rFonts w:ascii="Calibri" w:hAnsi="Calibri"/>
-                <w:sz w:val="18"/>
-              </w:rPr>
-              <w:t>0.323</w:t>
-            </w:r>
-          </w:p>
-        </w:tc>
       </w:tr>
       <w:tr>
         <w:tblPrEx>
@@ -7065,24 +6667,6 @@
             </w:r>
           </w:p>
         </w:tc>
-        <w:tc>
-          <w:tcPr>
-            <w:tcW w:w="960" w:type="dxa"/>
-          </w:tcPr>
-          <w:p>
-            <w:pPr>
-              <w:spacing w:line="240" w:lineRule="auto"/>
-              <w:jc w:val="right"/>
-            </w:pPr>
-            <w:r>
-              <w:rPr>
-                <w:rFonts w:ascii="Calibri" w:hAnsi="Calibri"/>
-                <w:sz w:val="18"/>
-              </w:rPr>
-              <w:t>0.221</w:t>
-            </w:r>
-          </w:p>
-        </w:tc>
       </w:tr>
       <w:tr>
         <w:tblPrEx>
@@ -7239,24 +6823,6 @@
             </w:r>
           </w:p>
         </w:tc>
-        <w:tc>
-          <w:tcPr>
-            <w:tcW w:w="960" w:type="dxa"/>
-          </w:tcPr>
-          <w:p>
-            <w:pPr>
-              <w:spacing w:line="240" w:lineRule="auto"/>
-              <w:jc w:val="right"/>
-            </w:pPr>
-            <w:r>
-              <w:rPr>
-                <w:rFonts w:ascii="Calibri" w:hAnsi="Calibri"/>
-                <w:sz w:val="18"/>
-              </w:rPr>
-              <w:t>0.243</w:t>
-            </w:r>
-          </w:p>
-        </w:tc>
       </w:tr>
       <w:tr>
         <w:tblPrEx>
@@ -7413,24 +6979,6 @@
             </w:r>
           </w:p>
         </w:tc>
-        <w:tc>
-          <w:tcPr>
-            <w:tcW w:w="960" w:type="dxa"/>
-          </w:tcPr>
-          <w:p>
-            <w:pPr>
-              <w:spacing w:line="240" w:lineRule="auto"/>
-              <w:jc w:val="right"/>
-            </w:pPr>
-            <w:r>
-              <w:rPr>
-                <w:rFonts w:ascii="Calibri" w:hAnsi="Calibri"/>
-                <w:sz w:val="18"/>
-              </w:rPr>
-              <w:t>0.220</w:t>
-            </w:r>
-          </w:p>
-        </w:tc>
       </w:tr>
       <w:tr>
         <w:tblPrEx>
@@ -7594,24 +7142,6 @@
             </w:r>
           </w:p>
         </w:tc>
-        <w:tc>
-          <w:tcPr>
-            <w:tcW w:w="960" w:type="dxa"/>
-          </w:tcPr>
-          <w:p>
-            <w:pPr>
-              <w:spacing w:line="240" w:lineRule="auto"/>
-              <w:jc w:val="right"/>
-            </w:pPr>
-            <w:r>
-              <w:rPr>
-                <w:rFonts w:ascii="Calibri" w:hAnsi="Calibri"/>
-                <w:sz w:val="18"/>
-              </w:rPr>
-              <w:t>0.404</w:t>
-            </w:r>
-          </w:p>
-        </w:tc>
       </w:tr>
       <w:tr>
         <w:tblPrEx>
@@ -7768,24 +7298,6 @@
             </w:r>
           </w:p>
         </w:tc>
-        <w:tc>
-          <w:tcPr>
-            <w:tcW w:w="960" w:type="dxa"/>
-          </w:tcPr>
-          <w:p>
-            <w:pPr>
-              <w:spacing w:line="240" w:lineRule="auto"/>
-              <w:jc w:val="right"/>
-            </w:pPr>
-            <w:r>
-              <w:rPr>
-                <w:rFonts w:ascii="Calibri" w:hAnsi="Calibri"/>
-                <w:sz w:val="18"/>
-              </w:rPr>
-              <w:t>0.553</w:t>
-            </w:r>
-          </w:p>
-        </w:tc>
       </w:tr>
       <w:tr>
         <w:tblPrEx>
@@ -7942,24 +7454,6 @@
             </w:r>
           </w:p>
         </w:tc>
-        <w:tc>
-          <w:tcPr>
-            <w:tcW w:w="960" w:type="dxa"/>
-          </w:tcPr>
-          <w:p>
-            <w:pPr>
-              <w:spacing w:line="240" w:lineRule="auto"/>
-              <w:jc w:val="right"/>
-            </w:pPr>
-            <w:r>
-              <w:rPr>
-                <w:rFonts w:ascii="Calibri" w:hAnsi="Calibri"/>
-                <w:sz w:val="18"/>
-              </w:rPr>
-              <w:t>0.550</w:t>
-            </w:r>
-          </w:p>
-        </w:tc>
       </w:tr>
       <w:tr>
         <w:tblPrEx>
@@ -8123,24 +7617,6 @@
             </w:r>
           </w:p>
         </w:tc>
-        <w:tc>
-          <w:tcPr>
-            <w:tcW w:w="960" w:type="dxa"/>
-          </w:tcPr>
-          <w:p>
-            <w:pPr>
-              <w:spacing w:line="240" w:lineRule="auto"/>
-              <w:jc w:val="right"/>
-            </w:pPr>
-            <w:r>
-              <w:rPr>
-                <w:rFonts w:ascii="Calibri" w:hAnsi="Calibri"/>
-                <w:sz w:val="18"/>
-              </w:rPr>
-              <w:t>0.598</w:t>
-            </w:r>
-          </w:p>
-        </w:tc>
       </w:tr>
       <w:tr>
         <w:tblPrEx>
@@ -8297,24 +7773,6 @@
             </w:r>
           </w:p>
         </w:tc>
-        <w:tc>
-          <w:tcPr>
-            <w:tcW w:w="960" w:type="dxa"/>
-          </w:tcPr>
-          <w:p>
-            <w:pPr>
-              <w:spacing w:line="240" w:lineRule="auto"/>
-              <w:jc w:val="right"/>
-            </w:pPr>
-            <w:r>
-              <w:rPr>
-                <w:rFonts w:ascii="Calibri" w:hAnsi="Calibri"/>
-                <w:sz w:val="18"/>
-              </w:rPr>
-              <w:t>0.753</w:t>
-            </w:r>
-          </w:p>
-        </w:tc>
       </w:tr>
       <w:tr>
         <w:tblPrEx>
@@ -8468,24 +7926,6 @@
                 <w:sz w:val="18"/>
               </w:rPr>
               <w:t>0.859</w:t>
-            </w:r>
-          </w:p>
-        </w:tc>
-        <w:tc>
-          <w:tcPr>
-            <w:tcW w:w="960" w:type="dxa"/>
-          </w:tcPr>
-          <w:p>
-            <w:pPr>
-              <w:spacing w:line="240" w:lineRule="auto"/>
-              <w:jc w:val="right"/>
-            </w:pPr>
-            <w:r>
-              <w:rPr>
-                <w:rFonts w:ascii="Calibri" w:hAnsi="Calibri"/>
-                <w:sz w:val="18"/>
-              </w:rPr>
-              <w:t>0.753</w:t>
             </w:r>
           </w:p>
         </w:tc>
@@ -8736,26 +8176,6 @@
                 <w:b/>
                 <w:sz w:val="18"/>
               </w:rPr>
-              <w:t>Mean Jaccard</w:t>
-            </w:r>
-          </w:p>
-        </w:tc>
-        <w:tc>
-          <w:tcPr>
-            <w:tcW w:w="1440" w:type="dxa"/>
-            <w:shd w:val="clear" w:color="auto" w:fill="D9E2F3"/>
-          </w:tcPr>
-          <w:p>
-            <w:pPr>
-              <w:spacing w:line="240" w:lineRule="auto"/>
-              <w:jc w:val="center"/>
-            </w:pPr>
-            <w:r>
-              <w:rPr>
-                <w:rFonts w:ascii="Calibri" w:hAnsi="Calibri"/>
-                <w:b/>
-                <w:sz w:val="18"/>
-              </w:rPr>
               <w:t>Mean Precision</w:t>
             </w:r>
           </w:p>
@@ -8870,24 +8290,6 @@
                 <w:rFonts w:ascii="Calibri" w:hAnsi="Calibri"/>
                 <w:sz w:val="18"/>
               </w:rPr>
-              <w:t>0.245</w:t>
-            </w:r>
-          </w:p>
-        </w:tc>
-        <w:tc>
-          <w:tcPr>
-            <w:tcW w:w="1440" w:type="dxa"/>
-          </w:tcPr>
-          <w:p>
-            <w:pPr>
-              <w:spacing w:line="240" w:lineRule="auto"/>
-              <w:jc w:val="right"/>
-            </w:pPr>
-            <w:r>
-              <w:rPr>
-                <w:rFonts w:ascii="Calibri" w:hAnsi="Calibri"/>
-                <w:sz w:val="18"/>
-              </w:rPr>
               <w:t>0.527</w:t>
             </w:r>
           </w:p>
@@ -8998,24 +8400,6 @@
                 <w:rFonts w:ascii="Calibri" w:hAnsi="Calibri"/>
                 <w:sz w:val="18"/>
               </w:rPr>
-              <w:t>0.310</w:t>
-            </w:r>
-          </w:p>
-        </w:tc>
-        <w:tc>
-          <w:tcPr>
-            <w:tcW w:w="1440" w:type="dxa"/>
-          </w:tcPr>
-          <w:p>
-            <w:pPr>
-              <w:spacing w:line="240" w:lineRule="auto"/>
-              <w:jc w:val="right"/>
-            </w:pPr>
-            <w:r>
-              <w:rPr>
-                <w:rFonts w:ascii="Calibri" w:hAnsi="Calibri"/>
-                <w:sz w:val="18"/>
-              </w:rPr>
               <w:t>0.460</w:t>
             </w:r>
           </w:p>
@@ -9109,24 +8493,6 @@
                 <w:sz w:val="18"/>
               </w:rPr>
               <w:t>0.481</w:t>
-            </w:r>
-          </w:p>
-        </w:tc>
-        <w:tc>
-          <w:tcPr>
-            <w:tcW w:w="1440" w:type="dxa"/>
-          </w:tcPr>
-          <w:p>
-            <w:pPr>
-              <w:spacing w:line="240" w:lineRule="auto"/>
-              <w:jc w:val="right"/>
-            </w:pPr>
-            <w:r>
-              <w:rPr>
-                <w:rFonts w:ascii="Calibri" w:hAnsi="Calibri"/>
-                <w:sz w:val="18"/>
-              </w:rPr>
-              <w:t>0.343</w:t>
             </w:r>
           </w:p>
         </w:tc>

</xml_diff>

<commit_message>
Rename FP/FN error categories
- FP: "Valid diagnosis subtype" → "Diagnosis subtype"
- FN: "Missed valid diagnosis" → "Missed diagnosis"

Co-Authored-By: Claude Opus 4.6 <noreply@anthropic.com>
</commit_message>
<xml_diff>
--- a/dissertation_data_summary.docx
+++ b/dissertation_data_summary.docx
@@ -13567,7 +13567,7 @@
                 <w:rFonts w:ascii="Calibri" w:hAnsi="Calibri"/>
                 <w:sz w:val="18"/>
               </w:rPr>
-              <w:t>⚠ Valid diagnosis subtype (reference gap)</w:t>
+              <w:t>⚠ Diagnosis subtype (reference gap)</w:t>
             </w:r>
           </w:p>
         </w:tc>
@@ -14105,7 +14105,7 @@
           <w:b/>
           <w:sz w:val="20"/>
         </w:rPr>
-        <w:t>Valid diagnosis subtype</w:t>
+        <w:t>Diagnosis subtype</w:t>
       </w:r>
       <w:r>
         <w:rPr>
@@ -15013,7 +15013,7 @@
                 <w:rFonts w:ascii="Calibri" w:hAnsi="Calibri"/>
                 <w:sz w:val="18"/>
               </w:rPr>
-              <w:t>⚠ Missed valid diagnosis</w:t>
+              <w:t>⚠ Missed diagnosis</w:t>
             </w:r>
           </w:p>
         </w:tc>
@@ -15176,7 +15176,7 @@
           <w:b/>
           <w:sz w:val="20"/>
         </w:rPr>
-        <w:t>Missed valid diagnosis</w:t>
+        <w:t>Missed diagnosis</w:t>
       </w:r>
       <w:r>
         <w:rPr>

</xml_diff>

<commit_message>
Reorder summary table: group performance metrics together
Performance metrics (F1, Jaccard, Precision, Recall) now appear
together, followed by search behaviour and resource usage rows.

Co-Authored-By: Claude Opus 4.6 <noreply@anthropic.com>
</commit_message>
<xml_diff>
--- a/dissertation_data_summary.docx
+++ b/dissertation_data_summary.docx
@@ -8415,7 +8415,7 @@
                 <w:rFonts w:ascii="Calibri" w:hAnsi="Calibri"/>
                 <w:sz w:val="18"/>
               </w:rPr>
-              <w:t>Mean searches/condition</w:t>
+              <w:t>Mean Precision</w:t>
             </w:r>
           </w:p>
         </w:tc>
@@ -8433,7 +8433,7 @@
                 <w:rFonts w:ascii="Calibri" w:hAnsi="Calibri"/>
                 <w:sz w:val="18"/>
               </w:rPr>
-              <w:t>7.4</w:t>
+              <w:t>0.527</w:t>
             </w:r>
           </w:p>
         </w:tc>
@@ -8451,7 +8451,7 @@
                 <w:rFonts w:ascii="Calibri" w:hAnsi="Calibri"/>
                 <w:sz w:val="18"/>
               </w:rPr>
-              <w:t>13.8</w:t>
+              <w:t>0.460</w:t>
             </w:r>
           </w:p>
         </w:tc>
@@ -8469,7 +8469,7 @@
                 <w:rFonts w:ascii="Calibri" w:hAnsi="Calibri"/>
                 <w:sz w:val="18"/>
               </w:rPr>
-              <w:t>11.4</w:t>
+              <w:t>0.470</w:t>
             </w:r>
           </w:p>
         </w:tc>
@@ -8507,7 +8507,7 @@
                 <w:rFonts w:ascii="Calibri" w:hAnsi="Calibri"/>
                 <w:sz w:val="18"/>
               </w:rPr>
-              <w:t>Mean AI codelist size</w:t>
+              <w:t>Mean Recall</w:t>
             </w:r>
           </w:p>
         </w:tc>
@@ -8525,7 +8525,7 @@
                 <w:rFonts w:ascii="Calibri" w:hAnsi="Calibri"/>
                 <w:sz w:val="18"/>
               </w:rPr>
-              <w:t>89.8</w:t>
+              <w:t>0.390</w:t>
             </w:r>
           </w:p>
         </w:tc>
@@ -8543,7 +8543,7 @@
                 <w:rFonts w:ascii="Calibri" w:hAnsi="Calibri"/>
                 <w:sz w:val="18"/>
               </w:rPr>
-              <w:t>161.5</w:t>
+              <w:t>0.466</w:t>
             </w:r>
           </w:p>
         </w:tc>
@@ -8561,7 +8561,7 @@
                 <w:rFonts w:ascii="Calibri" w:hAnsi="Calibri"/>
                 <w:sz w:val="18"/>
               </w:rPr>
-              <w:t>155.6</w:t>
+              <w:t>0.516</w:t>
             </w:r>
           </w:p>
         </w:tc>
@@ -8599,7 +8599,7 @@
                 <w:rFonts w:ascii="Calibri" w:hAnsi="Calibri"/>
                 <w:sz w:val="18"/>
               </w:rPr>
-              <w:t>Mean Precision</w:t>
+              <w:t>Mean searches/condition</w:t>
             </w:r>
           </w:p>
         </w:tc>
@@ -8617,7 +8617,7 @@
                 <w:rFonts w:ascii="Calibri" w:hAnsi="Calibri"/>
                 <w:sz w:val="18"/>
               </w:rPr>
-              <w:t>0.527</w:t>
+              <w:t>7.4</w:t>
             </w:r>
           </w:p>
         </w:tc>
@@ -8635,7 +8635,7 @@
                 <w:rFonts w:ascii="Calibri" w:hAnsi="Calibri"/>
                 <w:sz w:val="18"/>
               </w:rPr>
-              <w:t>0.460</w:t>
+              <w:t>13.8</w:t>
             </w:r>
           </w:p>
         </w:tc>
@@ -8653,7 +8653,7 @@
                 <w:rFonts w:ascii="Calibri" w:hAnsi="Calibri"/>
                 <w:sz w:val="18"/>
               </w:rPr>
-              <w:t>0.470</w:t>
+              <w:t>11.4</w:t>
             </w:r>
           </w:p>
         </w:tc>
@@ -8691,7 +8691,7 @@
                 <w:rFonts w:ascii="Calibri" w:hAnsi="Calibri"/>
                 <w:sz w:val="18"/>
               </w:rPr>
-              <w:t>Mean Recall</w:t>
+              <w:t>Mean AI codelist size</w:t>
             </w:r>
           </w:p>
         </w:tc>
@@ -8709,7 +8709,7 @@
                 <w:rFonts w:ascii="Calibri" w:hAnsi="Calibri"/>
                 <w:sz w:val="18"/>
               </w:rPr>
-              <w:t>0.390</w:t>
+              <w:t>89.8</w:t>
             </w:r>
           </w:p>
         </w:tc>
@@ -8727,7 +8727,7 @@
                 <w:rFonts w:ascii="Calibri" w:hAnsi="Calibri"/>
                 <w:sz w:val="18"/>
               </w:rPr>
-              <w:t>0.466</w:t>
+              <w:t>161.5</w:t>
             </w:r>
           </w:p>
         </w:tc>
@@ -8745,7 +8745,7 @@
                 <w:rFonts w:ascii="Calibri" w:hAnsi="Calibri"/>
                 <w:sz w:val="18"/>
               </w:rPr>
-              <w:t>0.516</w:t>
+              <w:t>155.6</w:t>
             </w:r>
           </w:p>
         </w:tc>

</xml_diff>

<commit_message>
Swap column order: Ref Codes before AI Codes in Tables 2 and 4
Co-Authored-By: Claude Opus 4.6 <noreply@anthropic.com>
</commit_message>
<xml_diff>
--- a/dissertation_data_summary.docx
+++ b/dissertation_data_summary.docx
@@ -3094,27 +3094,27 @@
                 <w:b/>
                 <w:sz w:val="18"/>
               </w:rPr>
+              <w:t>Ref Codes</w:t>
+            </w:r>
+          </w:p>
+        </w:tc>
+        <w:tc>
+          <w:tcPr>
+            <w:tcW w:w="960" w:type="dxa"/>
+            <w:shd w:val="clear" w:color="auto" w:fill="D9E2F3"/>
+          </w:tcPr>
+          <w:p>
+            <w:pPr>
+              <w:spacing w:line="240" w:lineRule="auto"/>
+              <w:jc w:val="center"/>
+            </w:pPr>
+            <w:r>
+              <w:rPr>
+                <w:rFonts w:ascii="Calibri" w:hAnsi="Calibri"/>
+                <w:b/>
+                <w:sz w:val="18"/>
+              </w:rPr>
               <w:t>AI Codes</w:t>
-            </w:r>
-          </w:p>
-        </w:tc>
-        <w:tc>
-          <w:tcPr>
-            <w:tcW w:w="960" w:type="dxa"/>
-            <w:shd w:val="clear" w:color="auto" w:fill="D9E2F3"/>
-          </w:tcPr>
-          <w:p>
-            <w:pPr>
-              <w:spacing w:line="240" w:lineRule="auto"/>
-              <w:jc w:val="center"/>
-            </w:pPr>
-            <w:r>
-              <w:rPr>
-                <w:rFonts w:ascii="Calibri" w:hAnsi="Calibri"/>
-                <w:b/>
-                <w:sz w:val="18"/>
-              </w:rPr>
-              <w:t>Ref Codes</w:t>
             </w:r>
           </w:p>
         </w:tc>
@@ -3265,25 +3265,25 @@
                 <w:rFonts w:ascii="Calibri" w:hAnsi="Calibri"/>
                 <w:sz w:val="18"/>
               </w:rPr>
+              <w:t>18</w:t>
+            </w:r>
+          </w:p>
+        </w:tc>
+        <w:tc>
+          <w:tcPr>
+            <w:tcW w:w="960" w:type="dxa"/>
+          </w:tcPr>
+          <w:p>
+            <w:pPr>
+              <w:spacing w:line="240" w:lineRule="auto"/>
+              <w:jc w:val="right"/>
+            </w:pPr>
+            <w:r>
+              <w:rPr>
+                <w:rFonts w:ascii="Calibri" w:hAnsi="Calibri"/>
+                <w:sz w:val="18"/>
+              </w:rPr>
               <w:t>46</w:t>
-            </w:r>
-          </w:p>
-        </w:tc>
-        <w:tc>
-          <w:tcPr>
-            <w:tcW w:w="960" w:type="dxa"/>
-          </w:tcPr>
-          <w:p>
-            <w:pPr>
-              <w:spacing w:line="240" w:lineRule="auto"/>
-              <w:jc w:val="right"/>
-            </w:pPr>
-            <w:r>
-              <w:rPr>
-                <w:rFonts w:ascii="Calibri" w:hAnsi="Calibri"/>
-                <w:sz w:val="18"/>
-              </w:rPr>
-              <w:t>18</w:t>
             </w:r>
           </w:p>
         </w:tc>
@@ -3421,25 +3421,25 @@
                 <w:rFonts w:ascii="Calibri" w:hAnsi="Calibri"/>
                 <w:sz w:val="18"/>
               </w:rPr>
+              <w:t>18</w:t>
+            </w:r>
+          </w:p>
+        </w:tc>
+        <w:tc>
+          <w:tcPr>
+            <w:tcW w:w="960" w:type="dxa"/>
+          </w:tcPr>
+          <w:p>
+            <w:pPr>
+              <w:spacing w:line="240" w:lineRule="auto"/>
+              <w:jc w:val="right"/>
+            </w:pPr>
+            <w:r>
+              <w:rPr>
+                <w:rFonts w:ascii="Calibri" w:hAnsi="Calibri"/>
+                <w:sz w:val="18"/>
+              </w:rPr>
               <w:t>33</w:t>
-            </w:r>
-          </w:p>
-        </w:tc>
-        <w:tc>
-          <w:tcPr>
-            <w:tcW w:w="960" w:type="dxa"/>
-          </w:tcPr>
-          <w:p>
-            <w:pPr>
-              <w:spacing w:line="240" w:lineRule="auto"/>
-              <w:jc w:val="right"/>
-            </w:pPr>
-            <w:r>
-              <w:rPr>
-                <w:rFonts w:ascii="Calibri" w:hAnsi="Calibri"/>
-                <w:sz w:val="18"/>
-              </w:rPr>
-              <w:t>18</w:t>
             </w:r>
           </w:p>
         </w:tc>
@@ -3577,25 +3577,25 @@
                 <w:rFonts w:ascii="Calibri" w:hAnsi="Calibri"/>
                 <w:sz w:val="18"/>
               </w:rPr>
+              <w:t>18</w:t>
+            </w:r>
+          </w:p>
+        </w:tc>
+        <w:tc>
+          <w:tcPr>
+            <w:tcW w:w="960" w:type="dxa"/>
+          </w:tcPr>
+          <w:p>
+            <w:pPr>
+              <w:spacing w:line="240" w:lineRule="auto"/>
+              <w:jc w:val="right"/>
+            </w:pPr>
+            <w:r>
+              <w:rPr>
+                <w:rFonts w:ascii="Calibri" w:hAnsi="Calibri"/>
+                <w:sz w:val="18"/>
+              </w:rPr>
               <w:t>31</w:t>
-            </w:r>
-          </w:p>
-        </w:tc>
-        <w:tc>
-          <w:tcPr>
-            <w:tcW w:w="960" w:type="dxa"/>
-          </w:tcPr>
-          <w:p>
-            <w:pPr>
-              <w:spacing w:line="240" w:lineRule="auto"/>
-              <w:jc w:val="right"/>
-            </w:pPr>
-            <w:r>
-              <w:rPr>
-                <w:rFonts w:ascii="Calibri" w:hAnsi="Calibri"/>
-                <w:sz w:val="18"/>
-              </w:rPr>
-              <w:t>18</w:t>
             </w:r>
           </w:p>
         </w:tc>
@@ -3740,25 +3740,25 @@
                 <w:rFonts w:ascii="Calibri" w:hAnsi="Calibri"/>
                 <w:sz w:val="18"/>
               </w:rPr>
+              <w:t>84</w:t>
+            </w:r>
+          </w:p>
+        </w:tc>
+        <w:tc>
+          <w:tcPr>
+            <w:tcW w:w="960" w:type="dxa"/>
+          </w:tcPr>
+          <w:p>
+            <w:pPr>
+              <w:spacing w:line="240" w:lineRule="auto"/>
+              <w:jc w:val="right"/>
+            </w:pPr>
+            <w:r>
+              <w:rPr>
+                <w:rFonts w:ascii="Calibri" w:hAnsi="Calibri"/>
+                <w:sz w:val="18"/>
+              </w:rPr>
               <w:t>63</w:t>
-            </w:r>
-          </w:p>
-        </w:tc>
-        <w:tc>
-          <w:tcPr>
-            <w:tcW w:w="960" w:type="dxa"/>
-          </w:tcPr>
-          <w:p>
-            <w:pPr>
-              <w:spacing w:line="240" w:lineRule="auto"/>
-              <w:jc w:val="right"/>
-            </w:pPr>
-            <w:r>
-              <w:rPr>
-                <w:rFonts w:ascii="Calibri" w:hAnsi="Calibri"/>
-                <w:sz w:val="18"/>
-              </w:rPr>
-              <w:t>84</w:t>
             </w:r>
           </w:p>
         </w:tc>
@@ -3896,25 +3896,25 @@
                 <w:rFonts w:ascii="Calibri" w:hAnsi="Calibri"/>
                 <w:sz w:val="18"/>
               </w:rPr>
+              <w:t>84</w:t>
+            </w:r>
+          </w:p>
+        </w:tc>
+        <w:tc>
+          <w:tcPr>
+            <w:tcW w:w="960" w:type="dxa"/>
+          </w:tcPr>
+          <w:p>
+            <w:pPr>
+              <w:spacing w:line="240" w:lineRule="auto"/>
+              <w:jc w:val="right"/>
+            </w:pPr>
+            <w:r>
+              <w:rPr>
+                <w:rFonts w:ascii="Calibri" w:hAnsi="Calibri"/>
+                <w:sz w:val="18"/>
+              </w:rPr>
               <w:t>124</w:t>
-            </w:r>
-          </w:p>
-        </w:tc>
-        <w:tc>
-          <w:tcPr>
-            <w:tcW w:w="960" w:type="dxa"/>
-          </w:tcPr>
-          <w:p>
-            <w:pPr>
-              <w:spacing w:line="240" w:lineRule="auto"/>
-              <w:jc w:val="right"/>
-            </w:pPr>
-            <w:r>
-              <w:rPr>
-                <w:rFonts w:ascii="Calibri" w:hAnsi="Calibri"/>
-                <w:sz w:val="18"/>
-              </w:rPr>
-              <w:t>84</w:t>
             </w:r>
           </w:p>
         </w:tc>
@@ -4052,25 +4052,25 @@
                 <w:rFonts w:ascii="Calibri" w:hAnsi="Calibri"/>
                 <w:sz w:val="18"/>
               </w:rPr>
+              <w:t>84</w:t>
+            </w:r>
+          </w:p>
+        </w:tc>
+        <w:tc>
+          <w:tcPr>
+            <w:tcW w:w="960" w:type="dxa"/>
+          </w:tcPr>
+          <w:p>
+            <w:pPr>
+              <w:spacing w:line="240" w:lineRule="auto"/>
+              <w:jc w:val="right"/>
+            </w:pPr>
+            <w:r>
+              <w:rPr>
+                <w:rFonts w:ascii="Calibri" w:hAnsi="Calibri"/>
+                <w:sz w:val="18"/>
+              </w:rPr>
               <w:t>99</w:t>
-            </w:r>
-          </w:p>
-        </w:tc>
-        <w:tc>
-          <w:tcPr>
-            <w:tcW w:w="960" w:type="dxa"/>
-          </w:tcPr>
-          <w:p>
-            <w:pPr>
-              <w:spacing w:line="240" w:lineRule="auto"/>
-              <w:jc w:val="right"/>
-            </w:pPr>
-            <w:r>
-              <w:rPr>
-                <w:rFonts w:ascii="Calibri" w:hAnsi="Calibri"/>
-                <w:sz w:val="18"/>
-              </w:rPr>
-              <w:t>84</w:t>
             </w:r>
           </w:p>
         </w:tc>
@@ -4215,25 +4215,25 @@
                 <w:rFonts w:ascii="Calibri" w:hAnsi="Calibri"/>
                 <w:sz w:val="18"/>
               </w:rPr>
+              <w:t>130</w:t>
+            </w:r>
+          </w:p>
+        </w:tc>
+        <w:tc>
+          <w:tcPr>
+            <w:tcW w:w="960" w:type="dxa"/>
+          </w:tcPr>
+          <w:p>
+            <w:pPr>
+              <w:spacing w:line="240" w:lineRule="auto"/>
+              <w:jc w:val="right"/>
+            </w:pPr>
+            <w:r>
+              <w:rPr>
+                <w:rFonts w:ascii="Calibri" w:hAnsi="Calibri"/>
+                <w:sz w:val="18"/>
+              </w:rPr>
               <w:t>84</w:t>
-            </w:r>
-          </w:p>
-        </w:tc>
-        <w:tc>
-          <w:tcPr>
-            <w:tcW w:w="960" w:type="dxa"/>
-          </w:tcPr>
-          <w:p>
-            <w:pPr>
-              <w:spacing w:line="240" w:lineRule="auto"/>
-              <w:jc w:val="right"/>
-            </w:pPr>
-            <w:r>
-              <w:rPr>
-                <w:rFonts w:ascii="Calibri" w:hAnsi="Calibri"/>
-                <w:sz w:val="18"/>
-              </w:rPr>
-              <w:t>130</w:t>
             </w:r>
           </w:p>
         </w:tc>
@@ -4371,25 +4371,25 @@
                 <w:rFonts w:ascii="Calibri" w:hAnsi="Calibri"/>
                 <w:sz w:val="18"/>
               </w:rPr>
+              <w:t>130</w:t>
+            </w:r>
+          </w:p>
+        </w:tc>
+        <w:tc>
+          <w:tcPr>
+            <w:tcW w:w="960" w:type="dxa"/>
+          </w:tcPr>
+          <w:p>
+            <w:pPr>
+              <w:spacing w:line="240" w:lineRule="auto"/>
+              <w:jc w:val="right"/>
+            </w:pPr>
+            <w:r>
+              <w:rPr>
+                <w:rFonts w:ascii="Calibri" w:hAnsi="Calibri"/>
+                <w:sz w:val="18"/>
+              </w:rPr>
               <w:t>426</w:t>
-            </w:r>
-          </w:p>
-        </w:tc>
-        <w:tc>
-          <w:tcPr>
-            <w:tcW w:w="960" w:type="dxa"/>
-          </w:tcPr>
-          <w:p>
-            <w:pPr>
-              <w:spacing w:line="240" w:lineRule="auto"/>
-              <w:jc w:val="right"/>
-            </w:pPr>
-            <w:r>
-              <w:rPr>
-                <w:rFonts w:ascii="Calibri" w:hAnsi="Calibri"/>
-                <w:sz w:val="18"/>
-              </w:rPr>
-              <w:t>130</w:t>
             </w:r>
           </w:p>
         </w:tc>
@@ -4527,25 +4527,25 @@
                 <w:rFonts w:ascii="Calibri" w:hAnsi="Calibri"/>
                 <w:sz w:val="18"/>
               </w:rPr>
+              <w:t>130</w:t>
+            </w:r>
+          </w:p>
+        </w:tc>
+        <w:tc>
+          <w:tcPr>
+            <w:tcW w:w="960" w:type="dxa"/>
+          </w:tcPr>
+          <w:p>
+            <w:pPr>
+              <w:spacing w:line="240" w:lineRule="auto"/>
+              <w:jc w:val="right"/>
+            </w:pPr>
+            <w:r>
+              <w:rPr>
+                <w:rFonts w:ascii="Calibri" w:hAnsi="Calibri"/>
+                <w:sz w:val="18"/>
+              </w:rPr>
               <w:t>304</w:t>
-            </w:r>
-          </w:p>
-        </w:tc>
-        <w:tc>
-          <w:tcPr>
-            <w:tcW w:w="960" w:type="dxa"/>
-          </w:tcPr>
-          <w:p>
-            <w:pPr>
-              <w:spacing w:line="240" w:lineRule="auto"/>
-              <w:jc w:val="right"/>
-            </w:pPr>
-            <w:r>
-              <w:rPr>
-                <w:rFonts w:ascii="Calibri" w:hAnsi="Calibri"/>
-                <w:sz w:val="18"/>
-              </w:rPr>
-              <w:t>130</w:t>
             </w:r>
           </w:p>
         </w:tc>
@@ -4690,25 +4690,25 @@
                 <w:rFonts w:ascii="Calibri" w:hAnsi="Calibri"/>
                 <w:sz w:val="18"/>
               </w:rPr>
+              <w:t>214</w:t>
+            </w:r>
+          </w:p>
+        </w:tc>
+        <w:tc>
+          <w:tcPr>
+            <w:tcW w:w="960" w:type="dxa"/>
+          </w:tcPr>
+          <w:p>
+            <w:pPr>
+              <w:spacing w:line="240" w:lineRule="auto"/>
+              <w:jc w:val="right"/>
+            </w:pPr>
+            <w:r>
+              <w:rPr>
+                <w:rFonts w:ascii="Calibri" w:hAnsi="Calibri"/>
+                <w:sz w:val="18"/>
+              </w:rPr>
               <w:t>110</w:t>
-            </w:r>
-          </w:p>
-        </w:tc>
-        <w:tc>
-          <w:tcPr>
-            <w:tcW w:w="960" w:type="dxa"/>
-          </w:tcPr>
-          <w:p>
-            <w:pPr>
-              <w:spacing w:line="240" w:lineRule="auto"/>
-              <w:jc w:val="right"/>
-            </w:pPr>
-            <w:r>
-              <w:rPr>
-                <w:rFonts w:ascii="Calibri" w:hAnsi="Calibri"/>
-                <w:sz w:val="18"/>
-              </w:rPr>
-              <w:t>214</w:t>
             </w:r>
           </w:p>
         </w:tc>
@@ -4846,25 +4846,25 @@
                 <w:rFonts w:ascii="Calibri" w:hAnsi="Calibri"/>
                 <w:sz w:val="18"/>
               </w:rPr>
+              <w:t>214</w:t>
+            </w:r>
+          </w:p>
+        </w:tc>
+        <w:tc>
+          <w:tcPr>
+            <w:tcW w:w="960" w:type="dxa"/>
+          </w:tcPr>
+          <w:p>
+            <w:pPr>
+              <w:spacing w:line="240" w:lineRule="auto"/>
+              <w:jc w:val="right"/>
+            </w:pPr>
+            <w:r>
+              <w:rPr>
+                <w:rFonts w:ascii="Calibri" w:hAnsi="Calibri"/>
+                <w:sz w:val="18"/>
+              </w:rPr>
               <w:t>153</w:t>
-            </w:r>
-          </w:p>
-        </w:tc>
-        <w:tc>
-          <w:tcPr>
-            <w:tcW w:w="960" w:type="dxa"/>
-          </w:tcPr>
-          <w:p>
-            <w:pPr>
-              <w:spacing w:line="240" w:lineRule="auto"/>
-              <w:jc w:val="right"/>
-            </w:pPr>
-            <w:r>
-              <w:rPr>
-                <w:rFonts w:ascii="Calibri" w:hAnsi="Calibri"/>
-                <w:sz w:val="18"/>
-              </w:rPr>
-              <w:t>214</w:t>
             </w:r>
           </w:p>
         </w:tc>
@@ -5002,25 +5002,25 @@
                 <w:rFonts w:ascii="Calibri" w:hAnsi="Calibri"/>
                 <w:sz w:val="18"/>
               </w:rPr>
+              <w:t>214</w:t>
+            </w:r>
+          </w:p>
+        </w:tc>
+        <w:tc>
+          <w:tcPr>
+            <w:tcW w:w="960" w:type="dxa"/>
+          </w:tcPr>
+          <w:p>
+            <w:pPr>
+              <w:spacing w:line="240" w:lineRule="auto"/>
+              <w:jc w:val="right"/>
+            </w:pPr>
+            <w:r>
+              <w:rPr>
+                <w:rFonts w:ascii="Calibri" w:hAnsi="Calibri"/>
+                <w:sz w:val="18"/>
+              </w:rPr>
               <w:t>172</w:t>
-            </w:r>
-          </w:p>
-        </w:tc>
-        <w:tc>
-          <w:tcPr>
-            <w:tcW w:w="960" w:type="dxa"/>
-          </w:tcPr>
-          <w:p>
-            <w:pPr>
-              <w:spacing w:line="240" w:lineRule="auto"/>
-              <w:jc w:val="right"/>
-            </w:pPr>
-            <w:r>
-              <w:rPr>
-                <w:rFonts w:ascii="Calibri" w:hAnsi="Calibri"/>
-                <w:sz w:val="18"/>
-              </w:rPr>
-              <w:t>214</w:t>
             </w:r>
           </w:p>
         </w:tc>
@@ -5165,25 +5165,25 @@
                 <w:rFonts w:ascii="Calibri" w:hAnsi="Calibri"/>
                 <w:sz w:val="18"/>
               </w:rPr>
+              <w:t>127</w:t>
+            </w:r>
+          </w:p>
+        </w:tc>
+        <w:tc>
+          <w:tcPr>
+            <w:tcW w:w="960" w:type="dxa"/>
+          </w:tcPr>
+          <w:p>
+            <w:pPr>
+              <w:spacing w:line="240" w:lineRule="auto"/>
+              <w:jc w:val="right"/>
+            </w:pPr>
+            <w:r>
+              <w:rPr>
+                <w:rFonts w:ascii="Calibri" w:hAnsi="Calibri"/>
+                <w:sz w:val="18"/>
+              </w:rPr>
               <w:t>79</w:t>
-            </w:r>
-          </w:p>
-        </w:tc>
-        <w:tc>
-          <w:tcPr>
-            <w:tcW w:w="960" w:type="dxa"/>
-          </w:tcPr>
-          <w:p>
-            <w:pPr>
-              <w:spacing w:line="240" w:lineRule="auto"/>
-              <w:jc w:val="right"/>
-            </w:pPr>
-            <w:r>
-              <w:rPr>
-                <w:rFonts w:ascii="Calibri" w:hAnsi="Calibri"/>
-                <w:sz w:val="18"/>
-              </w:rPr>
-              <w:t>127</w:t>
             </w:r>
           </w:p>
         </w:tc>
@@ -5321,25 +5321,25 @@
                 <w:rFonts w:ascii="Calibri" w:hAnsi="Calibri"/>
                 <w:sz w:val="18"/>
               </w:rPr>
+              <w:t>127</w:t>
+            </w:r>
+          </w:p>
+        </w:tc>
+        <w:tc>
+          <w:tcPr>
+            <w:tcW w:w="960" w:type="dxa"/>
+          </w:tcPr>
+          <w:p>
+            <w:pPr>
+              <w:spacing w:line="240" w:lineRule="auto"/>
+              <w:jc w:val="right"/>
+            </w:pPr>
+            <w:r>
+              <w:rPr>
+                <w:rFonts w:ascii="Calibri" w:hAnsi="Calibri"/>
+                <w:sz w:val="18"/>
+              </w:rPr>
               <w:t>169</w:t>
-            </w:r>
-          </w:p>
-        </w:tc>
-        <w:tc>
-          <w:tcPr>
-            <w:tcW w:w="960" w:type="dxa"/>
-          </w:tcPr>
-          <w:p>
-            <w:pPr>
-              <w:spacing w:line="240" w:lineRule="auto"/>
-              <w:jc w:val="right"/>
-            </w:pPr>
-            <w:r>
-              <w:rPr>
-                <w:rFonts w:ascii="Calibri" w:hAnsi="Calibri"/>
-                <w:sz w:val="18"/>
-              </w:rPr>
-              <w:t>127</w:t>
             </w:r>
           </w:p>
         </w:tc>
@@ -5477,25 +5477,25 @@
                 <w:rFonts w:ascii="Calibri" w:hAnsi="Calibri"/>
                 <w:sz w:val="18"/>
               </w:rPr>
+              <w:t>127</w:t>
+            </w:r>
+          </w:p>
+        </w:tc>
+        <w:tc>
+          <w:tcPr>
+            <w:tcW w:w="960" w:type="dxa"/>
+          </w:tcPr>
+          <w:p>
+            <w:pPr>
+              <w:spacing w:line="240" w:lineRule="auto"/>
+              <w:jc w:val="right"/>
+            </w:pPr>
+            <w:r>
+              <w:rPr>
+                <w:rFonts w:ascii="Calibri" w:hAnsi="Calibri"/>
+                <w:sz w:val="18"/>
+              </w:rPr>
               <w:t>191</w:t>
-            </w:r>
-          </w:p>
-        </w:tc>
-        <w:tc>
-          <w:tcPr>
-            <w:tcW w:w="960" w:type="dxa"/>
-          </w:tcPr>
-          <w:p>
-            <w:pPr>
-              <w:spacing w:line="240" w:lineRule="auto"/>
-              <w:jc w:val="right"/>
-            </w:pPr>
-            <w:r>
-              <w:rPr>
-                <w:rFonts w:ascii="Calibri" w:hAnsi="Calibri"/>
-                <w:sz w:val="18"/>
-              </w:rPr>
-              <w:t>127</w:t>
             </w:r>
           </w:p>
         </w:tc>
@@ -5640,25 +5640,25 @@
                 <w:rFonts w:ascii="Calibri" w:hAnsi="Calibri"/>
                 <w:sz w:val="18"/>
               </w:rPr>
+              <w:t>386</w:t>
+            </w:r>
+          </w:p>
+        </w:tc>
+        <w:tc>
+          <w:tcPr>
+            <w:tcW w:w="960" w:type="dxa"/>
+          </w:tcPr>
+          <w:p>
+            <w:pPr>
+              <w:spacing w:line="240" w:lineRule="auto"/>
+              <w:jc w:val="right"/>
+            </w:pPr>
+            <w:r>
+              <w:rPr>
+                <w:rFonts w:ascii="Calibri" w:hAnsi="Calibri"/>
+                <w:sz w:val="18"/>
+              </w:rPr>
               <w:t>36</w:t>
-            </w:r>
-          </w:p>
-        </w:tc>
-        <w:tc>
-          <w:tcPr>
-            <w:tcW w:w="960" w:type="dxa"/>
-          </w:tcPr>
-          <w:p>
-            <w:pPr>
-              <w:spacing w:line="240" w:lineRule="auto"/>
-              <w:jc w:val="right"/>
-            </w:pPr>
-            <w:r>
-              <w:rPr>
-                <w:rFonts w:ascii="Calibri" w:hAnsi="Calibri"/>
-                <w:sz w:val="18"/>
-              </w:rPr>
-              <w:t>386</w:t>
             </w:r>
           </w:p>
         </w:tc>
@@ -5796,25 +5796,25 @@
                 <w:rFonts w:ascii="Calibri" w:hAnsi="Calibri"/>
                 <w:sz w:val="18"/>
               </w:rPr>
+              <w:t>386</w:t>
+            </w:r>
+          </w:p>
+        </w:tc>
+        <w:tc>
+          <w:tcPr>
+            <w:tcW w:w="960" w:type="dxa"/>
+          </w:tcPr>
+          <w:p>
+            <w:pPr>
+              <w:spacing w:line="240" w:lineRule="auto"/>
+              <w:jc w:val="right"/>
+            </w:pPr>
+            <w:r>
+              <w:rPr>
+                <w:rFonts w:ascii="Calibri" w:hAnsi="Calibri"/>
+                <w:sz w:val="18"/>
+              </w:rPr>
               <w:t>204</w:t>
-            </w:r>
-          </w:p>
-        </w:tc>
-        <w:tc>
-          <w:tcPr>
-            <w:tcW w:w="960" w:type="dxa"/>
-          </w:tcPr>
-          <w:p>
-            <w:pPr>
-              <w:spacing w:line="240" w:lineRule="auto"/>
-              <w:jc w:val="right"/>
-            </w:pPr>
-            <w:r>
-              <w:rPr>
-                <w:rFonts w:ascii="Calibri" w:hAnsi="Calibri"/>
-                <w:sz w:val="18"/>
-              </w:rPr>
-              <w:t>386</w:t>
             </w:r>
           </w:p>
         </w:tc>
@@ -5952,25 +5952,25 @@
                 <w:rFonts w:ascii="Calibri" w:hAnsi="Calibri"/>
                 <w:sz w:val="18"/>
               </w:rPr>
+              <w:t>386</w:t>
+            </w:r>
+          </w:p>
+        </w:tc>
+        <w:tc>
+          <w:tcPr>
+            <w:tcW w:w="960" w:type="dxa"/>
+          </w:tcPr>
+          <w:p>
+            <w:pPr>
+              <w:spacing w:line="240" w:lineRule="auto"/>
+              <w:jc w:val="right"/>
+            </w:pPr>
+            <w:r>
+              <w:rPr>
+                <w:rFonts w:ascii="Calibri" w:hAnsi="Calibri"/>
+                <w:sz w:val="18"/>
+              </w:rPr>
               <w:t>206</w:t>
-            </w:r>
-          </w:p>
-        </w:tc>
-        <w:tc>
-          <w:tcPr>
-            <w:tcW w:w="960" w:type="dxa"/>
-          </w:tcPr>
-          <w:p>
-            <w:pPr>
-              <w:spacing w:line="240" w:lineRule="auto"/>
-              <w:jc w:val="right"/>
-            </w:pPr>
-            <w:r>
-              <w:rPr>
-                <w:rFonts w:ascii="Calibri" w:hAnsi="Calibri"/>
-                <w:sz w:val="18"/>
-              </w:rPr>
-              <w:t>386</w:t>
             </w:r>
           </w:p>
         </w:tc>
@@ -6115,25 +6115,25 @@
                 <w:rFonts w:ascii="Calibri" w:hAnsi="Calibri"/>
                 <w:sz w:val="18"/>
               </w:rPr>
+              <w:t>212</w:t>
+            </w:r>
+          </w:p>
+        </w:tc>
+        <w:tc>
+          <w:tcPr>
+            <w:tcW w:w="960" w:type="dxa"/>
+          </w:tcPr>
+          <w:p>
+            <w:pPr>
+              <w:spacing w:line="240" w:lineRule="auto"/>
+              <w:jc w:val="right"/>
+            </w:pPr>
+            <w:r>
+              <w:rPr>
+                <w:rFonts w:ascii="Calibri" w:hAnsi="Calibri"/>
+                <w:sz w:val="18"/>
+              </w:rPr>
               <w:t>62</w:t>
-            </w:r>
-          </w:p>
-        </w:tc>
-        <w:tc>
-          <w:tcPr>
-            <w:tcW w:w="960" w:type="dxa"/>
-          </w:tcPr>
-          <w:p>
-            <w:pPr>
-              <w:spacing w:line="240" w:lineRule="auto"/>
-              <w:jc w:val="right"/>
-            </w:pPr>
-            <w:r>
-              <w:rPr>
-                <w:rFonts w:ascii="Calibri" w:hAnsi="Calibri"/>
-                <w:sz w:val="18"/>
-              </w:rPr>
-              <w:t>212</w:t>
             </w:r>
           </w:p>
         </w:tc>
@@ -6271,25 +6271,25 @@
                 <w:rFonts w:ascii="Calibri" w:hAnsi="Calibri"/>
                 <w:sz w:val="18"/>
               </w:rPr>
+              <w:t>212</w:t>
+            </w:r>
+          </w:p>
+        </w:tc>
+        <w:tc>
+          <w:tcPr>
+            <w:tcW w:w="960" w:type="dxa"/>
+          </w:tcPr>
+          <w:p>
+            <w:pPr>
+              <w:spacing w:line="240" w:lineRule="auto"/>
+              <w:jc w:val="right"/>
+            </w:pPr>
+            <w:r>
+              <w:rPr>
+                <w:rFonts w:ascii="Calibri" w:hAnsi="Calibri"/>
+                <w:sz w:val="18"/>
+              </w:rPr>
               <w:t>111</w:t>
-            </w:r>
-          </w:p>
-        </w:tc>
-        <w:tc>
-          <w:tcPr>
-            <w:tcW w:w="960" w:type="dxa"/>
-          </w:tcPr>
-          <w:p>
-            <w:pPr>
-              <w:spacing w:line="240" w:lineRule="auto"/>
-              <w:jc w:val="right"/>
-            </w:pPr>
-            <w:r>
-              <w:rPr>
-                <w:rFonts w:ascii="Calibri" w:hAnsi="Calibri"/>
-                <w:sz w:val="18"/>
-              </w:rPr>
-              <w:t>212</w:t>
             </w:r>
           </w:p>
         </w:tc>
@@ -6427,25 +6427,25 @@
                 <w:rFonts w:ascii="Calibri" w:hAnsi="Calibri"/>
                 <w:sz w:val="18"/>
               </w:rPr>
+              <w:t>212</w:t>
+            </w:r>
+          </w:p>
+        </w:tc>
+        <w:tc>
+          <w:tcPr>
+            <w:tcW w:w="960" w:type="dxa"/>
+          </w:tcPr>
+          <w:p>
+            <w:pPr>
+              <w:spacing w:line="240" w:lineRule="auto"/>
+              <w:jc w:val="right"/>
+            </w:pPr>
+            <w:r>
+              <w:rPr>
+                <w:rFonts w:ascii="Calibri" w:hAnsi="Calibri"/>
+                <w:sz w:val="18"/>
+              </w:rPr>
               <w:t>116</w:t>
-            </w:r>
-          </w:p>
-        </w:tc>
-        <w:tc>
-          <w:tcPr>
-            <w:tcW w:w="960" w:type="dxa"/>
-          </w:tcPr>
-          <w:p>
-            <w:pPr>
-              <w:spacing w:line="240" w:lineRule="auto"/>
-              <w:jc w:val="right"/>
-            </w:pPr>
-            <w:r>
-              <w:rPr>
-                <w:rFonts w:ascii="Calibri" w:hAnsi="Calibri"/>
-                <w:sz w:val="18"/>
-              </w:rPr>
-              <w:t>212</w:t>
             </w:r>
           </w:p>
         </w:tc>
@@ -6590,25 +6590,25 @@
                 <w:rFonts w:ascii="Calibri" w:hAnsi="Calibri"/>
                 <w:sz w:val="18"/>
               </w:rPr>
+              <w:t>169</w:t>
+            </w:r>
+          </w:p>
+        </w:tc>
+        <w:tc>
+          <w:tcPr>
+            <w:tcW w:w="960" w:type="dxa"/>
+          </w:tcPr>
+          <w:p>
+            <w:pPr>
+              <w:spacing w:line="240" w:lineRule="auto"/>
+              <w:jc w:val="right"/>
+            </w:pPr>
+            <w:r>
+              <w:rPr>
+                <w:rFonts w:ascii="Calibri" w:hAnsi="Calibri"/>
+                <w:sz w:val="18"/>
+              </w:rPr>
               <w:t>85</w:t>
-            </w:r>
-          </w:p>
-        </w:tc>
-        <w:tc>
-          <w:tcPr>
-            <w:tcW w:w="960" w:type="dxa"/>
-          </w:tcPr>
-          <w:p>
-            <w:pPr>
-              <w:spacing w:line="240" w:lineRule="auto"/>
-              <w:jc w:val="right"/>
-            </w:pPr>
-            <w:r>
-              <w:rPr>
-                <w:rFonts w:ascii="Calibri" w:hAnsi="Calibri"/>
-                <w:sz w:val="18"/>
-              </w:rPr>
-              <w:t>169</w:t>
             </w:r>
           </w:p>
         </w:tc>
@@ -6746,25 +6746,25 @@
                 <w:rFonts w:ascii="Calibri" w:hAnsi="Calibri"/>
                 <w:sz w:val="18"/>
               </w:rPr>
+              <w:t>169</w:t>
+            </w:r>
+          </w:p>
+        </w:tc>
+        <w:tc>
+          <w:tcPr>
+            <w:tcW w:w="960" w:type="dxa"/>
+          </w:tcPr>
+          <w:p>
+            <w:pPr>
+              <w:spacing w:line="240" w:lineRule="auto"/>
+              <w:jc w:val="right"/>
+            </w:pPr>
+            <w:r>
+              <w:rPr>
+                <w:rFonts w:ascii="Calibri" w:hAnsi="Calibri"/>
+                <w:sz w:val="18"/>
+              </w:rPr>
               <w:t>97</w:t>
-            </w:r>
-          </w:p>
-        </w:tc>
-        <w:tc>
-          <w:tcPr>
-            <w:tcW w:w="960" w:type="dxa"/>
-          </w:tcPr>
-          <w:p>
-            <w:pPr>
-              <w:spacing w:line="240" w:lineRule="auto"/>
-              <w:jc w:val="right"/>
-            </w:pPr>
-            <w:r>
-              <w:rPr>
-                <w:rFonts w:ascii="Calibri" w:hAnsi="Calibri"/>
-                <w:sz w:val="18"/>
-              </w:rPr>
-              <w:t>169</w:t>
             </w:r>
           </w:p>
         </w:tc>
@@ -6902,25 +6902,25 @@
                 <w:rFonts w:ascii="Calibri" w:hAnsi="Calibri"/>
                 <w:sz w:val="18"/>
               </w:rPr>
+              <w:t>169</w:t>
+            </w:r>
+          </w:p>
+        </w:tc>
+        <w:tc>
+          <w:tcPr>
+            <w:tcW w:w="960" w:type="dxa"/>
+          </w:tcPr>
+          <w:p>
+            <w:pPr>
+              <w:spacing w:line="240" w:lineRule="auto"/>
+              <w:jc w:val="right"/>
+            </w:pPr>
+            <w:r>
+              <w:rPr>
+                <w:rFonts w:ascii="Calibri" w:hAnsi="Calibri"/>
+                <w:sz w:val="18"/>
+              </w:rPr>
               <w:t>164</w:t>
-            </w:r>
-          </w:p>
-        </w:tc>
-        <w:tc>
-          <w:tcPr>
-            <w:tcW w:w="960" w:type="dxa"/>
-          </w:tcPr>
-          <w:p>
-            <w:pPr>
-              <w:spacing w:line="240" w:lineRule="auto"/>
-              <w:jc w:val="right"/>
-            </w:pPr>
-            <w:r>
-              <w:rPr>
-                <w:rFonts w:ascii="Calibri" w:hAnsi="Calibri"/>
-                <w:sz w:val="18"/>
-              </w:rPr>
-              <w:t>169</w:t>
             </w:r>
           </w:p>
         </w:tc>
@@ -7065,25 +7065,25 @@
                 <w:rFonts w:ascii="Calibri" w:hAnsi="Calibri"/>
                 <w:sz w:val="18"/>
               </w:rPr>
+              <w:t>224</w:t>
+            </w:r>
+          </w:p>
+        </w:tc>
+        <w:tc>
+          <w:tcPr>
+            <w:tcW w:w="960" w:type="dxa"/>
+          </w:tcPr>
+          <w:p>
+            <w:pPr>
+              <w:spacing w:line="240" w:lineRule="auto"/>
+              <w:jc w:val="right"/>
+            </w:pPr>
+            <w:r>
+              <w:rPr>
+                <w:rFonts w:ascii="Calibri" w:hAnsi="Calibri"/>
+                <w:sz w:val="18"/>
+              </w:rPr>
               <w:t>169</w:t>
-            </w:r>
-          </w:p>
-        </w:tc>
-        <w:tc>
-          <w:tcPr>
-            <w:tcW w:w="960" w:type="dxa"/>
-          </w:tcPr>
-          <w:p>
-            <w:pPr>
-              <w:spacing w:line="240" w:lineRule="auto"/>
-              <w:jc w:val="right"/>
-            </w:pPr>
-            <w:r>
-              <w:rPr>
-                <w:rFonts w:ascii="Calibri" w:hAnsi="Calibri"/>
-                <w:sz w:val="18"/>
-              </w:rPr>
-              <w:t>224</w:t>
             </w:r>
           </w:p>
         </w:tc>
@@ -7221,25 +7221,25 @@
                 <w:rFonts w:ascii="Calibri" w:hAnsi="Calibri"/>
                 <w:sz w:val="18"/>
               </w:rPr>
+              <w:t>224</w:t>
+            </w:r>
+          </w:p>
+        </w:tc>
+        <w:tc>
+          <w:tcPr>
+            <w:tcW w:w="960" w:type="dxa"/>
+          </w:tcPr>
+          <w:p>
+            <w:pPr>
+              <w:spacing w:line="240" w:lineRule="auto"/>
+              <w:jc w:val="right"/>
+            </w:pPr>
+            <w:r>
+              <w:rPr>
+                <w:rFonts w:ascii="Calibri" w:hAnsi="Calibri"/>
+                <w:sz w:val="18"/>
+              </w:rPr>
               <w:t>183</w:t>
-            </w:r>
-          </w:p>
-        </w:tc>
-        <w:tc>
-          <w:tcPr>
-            <w:tcW w:w="960" w:type="dxa"/>
-          </w:tcPr>
-          <w:p>
-            <w:pPr>
-              <w:spacing w:line="240" w:lineRule="auto"/>
-              <w:jc w:val="right"/>
-            </w:pPr>
-            <w:r>
-              <w:rPr>
-                <w:rFonts w:ascii="Calibri" w:hAnsi="Calibri"/>
-                <w:sz w:val="18"/>
-              </w:rPr>
-              <w:t>224</w:t>
             </w:r>
           </w:p>
         </w:tc>
@@ -7377,25 +7377,25 @@
                 <w:rFonts w:ascii="Calibri" w:hAnsi="Calibri"/>
                 <w:sz w:val="18"/>
               </w:rPr>
+              <w:t>224</w:t>
+            </w:r>
+          </w:p>
+        </w:tc>
+        <w:tc>
+          <w:tcPr>
+            <w:tcW w:w="960" w:type="dxa"/>
+          </w:tcPr>
+          <w:p>
+            <w:pPr>
+              <w:spacing w:line="240" w:lineRule="auto"/>
+              <w:jc w:val="right"/>
+            </w:pPr>
+            <w:r>
+              <w:rPr>
+                <w:rFonts w:ascii="Calibri" w:hAnsi="Calibri"/>
+                <w:sz w:val="18"/>
+              </w:rPr>
               <w:t>182</w:t>
-            </w:r>
-          </w:p>
-        </w:tc>
-        <w:tc>
-          <w:tcPr>
-            <w:tcW w:w="960" w:type="dxa"/>
-          </w:tcPr>
-          <w:p>
-            <w:pPr>
-              <w:spacing w:line="240" w:lineRule="auto"/>
-              <w:jc w:val="right"/>
-            </w:pPr>
-            <w:r>
-              <w:rPr>
-                <w:rFonts w:ascii="Calibri" w:hAnsi="Calibri"/>
-                <w:sz w:val="18"/>
-              </w:rPr>
-              <w:t>224</w:t>
             </w:r>
           </w:p>
         </w:tc>
@@ -7540,25 +7540,25 @@
                 <w:rFonts w:ascii="Calibri" w:hAnsi="Calibri"/>
                 <w:sz w:val="18"/>
               </w:rPr>
+              <w:t>79</w:t>
+            </w:r>
+          </w:p>
+        </w:tc>
+        <w:tc>
+          <w:tcPr>
+            <w:tcW w:w="960" w:type="dxa"/>
+          </w:tcPr>
+          <w:p>
+            <w:pPr>
+              <w:spacing w:line="240" w:lineRule="auto"/>
+              <w:jc w:val="right"/>
+            </w:pPr>
+            <w:r>
+              <w:rPr>
+                <w:rFonts w:ascii="Calibri" w:hAnsi="Calibri"/>
+                <w:sz w:val="18"/>
+              </w:rPr>
               <w:t>60</w:t>
-            </w:r>
-          </w:p>
-        </w:tc>
-        <w:tc>
-          <w:tcPr>
-            <w:tcW w:w="960" w:type="dxa"/>
-          </w:tcPr>
-          <w:p>
-            <w:pPr>
-              <w:spacing w:line="240" w:lineRule="auto"/>
-              <w:jc w:val="right"/>
-            </w:pPr>
-            <w:r>
-              <w:rPr>
-                <w:rFonts w:ascii="Calibri" w:hAnsi="Calibri"/>
-                <w:sz w:val="18"/>
-              </w:rPr>
-              <w:t>79</w:t>
             </w:r>
           </w:p>
         </w:tc>
@@ -7696,25 +7696,25 @@
                 <w:rFonts w:ascii="Calibri" w:hAnsi="Calibri"/>
                 <w:sz w:val="18"/>
               </w:rPr>
+              <w:t>79</w:t>
+            </w:r>
+          </w:p>
+        </w:tc>
+        <w:tc>
+          <w:tcPr>
+            <w:tcW w:w="960" w:type="dxa"/>
+          </w:tcPr>
+          <w:p>
+            <w:pPr>
+              <w:spacing w:line="240" w:lineRule="auto"/>
+              <w:jc w:val="right"/>
+            </w:pPr>
+            <w:r>
+              <w:rPr>
+                <w:rFonts w:ascii="Calibri" w:hAnsi="Calibri"/>
+                <w:sz w:val="18"/>
+              </w:rPr>
               <w:t>91</w:t>
-            </w:r>
-          </w:p>
-        </w:tc>
-        <w:tc>
-          <w:tcPr>
-            <w:tcW w:w="960" w:type="dxa"/>
-          </w:tcPr>
-          <w:p>
-            <w:pPr>
-              <w:spacing w:line="240" w:lineRule="auto"/>
-              <w:jc w:val="right"/>
-            </w:pPr>
-            <w:r>
-              <w:rPr>
-                <w:rFonts w:ascii="Calibri" w:hAnsi="Calibri"/>
-                <w:sz w:val="18"/>
-              </w:rPr>
-              <w:t>79</w:t>
             </w:r>
           </w:p>
         </w:tc>
@@ -7852,25 +7852,25 @@
                 <w:rFonts w:ascii="Calibri" w:hAnsi="Calibri"/>
                 <w:sz w:val="18"/>
               </w:rPr>
+              <w:t>79</w:t>
+            </w:r>
+          </w:p>
+        </w:tc>
+        <w:tc>
+          <w:tcPr>
+            <w:tcW w:w="960" w:type="dxa"/>
+          </w:tcPr>
+          <w:p>
+            <w:pPr>
+              <w:spacing w:line="240" w:lineRule="auto"/>
+              <w:jc w:val="right"/>
+            </w:pPr>
+            <w:r>
+              <w:rPr>
+                <w:rFonts w:ascii="Calibri" w:hAnsi="Calibri"/>
+                <w:sz w:val="18"/>
+              </w:rPr>
               <w:t>91</w:t>
-            </w:r>
-          </w:p>
-        </w:tc>
-        <w:tc>
-          <w:tcPr>
-            <w:tcW w:w="960" w:type="dxa"/>
-          </w:tcPr>
-          <w:p>
-            <w:pPr>
-              <w:spacing w:line="240" w:lineRule="auto"/>
-              <w:jc w:val="right"/>
-            </w:pPr>
-            <w:r>
-              <w:rPr>
-                <w:rFonts w:ascii="Calibri" w:hAnsi="Calibri"/>
-                <w:sz w:val="18"/>
-              </w:rPr>
-              <w:t>79</w:t>
             </w:r>
           </w:p>
         </w:tc>
@@ -10736,27 +10736,27 @@
                 <w:b/>
                 <w:sz w:val="18"/>
               </w:rPr>
+              <w:t>Ref Codes</w:t>
+            </w:r>
+          </w:p>
+        </w:tc>
+        <w:tc>
+          <w:tcPr>
+            <w:tcW w:w="960" w:type="dxa"/>
+            <w:shd w:val="clear" w:color="auto" w:fill="D9E2F3"/>
+          </w:tcPr>
+          <w:p>
+            <w:pPr>
+              <w:spacing w:line="240" w:lineRule="auto"/>
+              <w:jc w:val="center"/>
+            </w:pPr>
+            <w:r>
+              <w:rPr>
+                <w:rFonts w:ascii="Calibri" w:hAnsi="Calibri"/>
+                <w:b/>
+                <w:sz w:val="18"/>
+              </w:rPr>
               <w:t>AI Codes</w:t>
-            </w:r>
-          </w:p>
-        </w:tc>
-        <w:tc>
-          <w:tcPr>
-            <w:tcW w:w="960" w:type="dxa"/>
-            <w:shd w:val="clear" w:color="auto" w:fill="D9E2F3"/>
-          </w:tcPr>
-          <w:p>
-            <w:pPr>
-              <w:spacing w:line="240" w:lineRule="auto"/>
-              <w:jc w:val="center"/>
-            </w:pPr>
-            <w:r>
-              <w:rPr>
-                <w:rFonts w:ascii="Calibri" w:hAnsi="Calibri"/>
-                <w:b/>
-                <w:sz w:val="18"/>
-              </w:rPr>
-              <w:t>Ref Codes</w:t>
             </w:r>
           </w:p>
         </w:tc>
@@ -10929,25 +10929,25 @@
                 <w:rFonts w:ascii="Calibri" w:hAnsi="Calibri"/>
                 <w:sz w:val="18"/>
               </w:rPr>
+              <w:t>18</w:t>
+            </w:r>
+          </w:p>
+        </w:tc>
+        <w:tc>
+          <w:tcPr>
+            <w:tcW w:w="960" w:type="dxa"/>
+          </w:tcPr>
+          <w:p>
+            <w:pPr>
+              <w:spacing w:line="240" w:lineRule="auto"/>
+              <w:jc w:val="right"/>
+            </w:pPr>
+            <w:r>
+              <w:rPr>
+                <w:rFonts w:ascii="Calibri" w:hAnsi="Calibri"/>
+                <w:sz w:val="18"/>
+              </w:rPr>
               <w:t>46</w:t>
-            </w:r>
-          </w:p>
-        </w:tc>
-        <w:tc>
-          <w:tcPr>
-            <w:tcW w:w="960" w:type="dxa"/>
-          </w:tcPr>
-          <w:p>
-            <w:pPr>
-              <w:spacing w:line="240" w:lineRule="auto"/>
-              <w:jc w:val="right"/>
-            </w:pPr>
-            <w:r>
-              <w:rPr>
-                <w:rFonts w:ascii="Calibri" w:hAnsi="Calibri"/>
-                <w:sz w:val="18"/>
-              </w:rPr>
-              <w:t>18</w:t>
             </w:r>
           </w:p>
         </w:tc>
@@ -11103,25 +11103,25 @@
                 <w:rFonts w:ascii="Calibri" w:hAnsi="Calibri"/>
                 <w:sz w:val="18"/>
               </w:rPr>
+              <w:t>38</w:t>
+            </w:r>
+          </w:p>
+        </w:tc>
+        <w:tc>
+          <w:tcPr>
+            <w:tcW w:w="960" w:type="dxa"/>
+          </w:tcPr>
+          <w:p>
+            <w:pPr>
+              <w:spacing w:line="240" w:lineRule="auto"/>
+              <w:jc w:val="right"/>
+            </w:pPr>
+            <w:r>
+              <w:rPr>
+                <w:rFonts w:ascii="Calibri" w:hAnsi="Calibri"/>
+                <w:sz w:val="18"/>
+              </w:rPr>
               <w:t>46</w:t>
-            </w:r>
-          </w:p>
-        </w:tc>
-        <w:tc>
-          <w:tcPr>
-            <w:tcW w:w="960" w:type="dxa"/>
-          </w:tcPr>
-          <w:p>
-            <w:pPr>
-              <w:spacing w:line="240" w:lineRule="auto"/>
-              <w:jc w:val="right"/>
-            </w:pPr>
-            <w:r>
-              <w:rPr>
-                <w:rFonts w:ascii="Calibri" w:hAnsi="Calibri"/>
-                <w:sz w:val="18"/>
-              </w:rPr>
-              <w:t>38</w:t>
             </w:r>
           </w:p>
         </w:tc>
@@ -11271,25 +11271,25 @@
                 <w:rFonts w:ascii="Calibri" w:hAnsi="Calibri"/>
                 <w:sz w:val="18"/>
               </w:rPr>
+              <w:t>30</w:t>
+            </w:r>
+          </w:p>
+        </w:tc>
+        <w:tc>
+          <w:tcPr>
+            <w:tcW w:w="960" w:type="dxa"/>
+          </w:tcPr>
+          <w:p>
+            <w:pPr>
+              <w:spacing w:line="240" w:lineRule="auto"/>
+              <w:jc w:val="right"/>
+            </w:pPr>
+            <w:r>
+              <w:rPr>
+                <w:rFonts w:ascii="Calibri" w:hAnsi="Calibri"/>
+                <w:sz w:val="18"/>
+              </w:rPr>
               <w:t>46</w:t>
-            </w:r>
-          </w:p>
-        </w:tc>
-        <w:tc>
-          <w:tcPr>
-            <w:tcW w:w="960" w:type="dxa"/>
-          </w:tcPr>
-          <w:p>
-            <w:pPr>
-              <w:spacing w:line="240" w:lineRule="auto"/>
-              <w:jc w:val="right"/>
-            </w:pPr>
-            <w:r>
-              <w:rPr>
-                <w:rFonts w:ascii="Calibri" w:hAnsi="Calibri"/>
-                <w:sz w:val="18"/>
-              </w:rPr>
-              <w:t>30</w:t>
             </w:r>
           </w:p>
         </w:tc>
@@ -11445,25 +11445,25 @@
                 <w:rFonts w:ascii="Calibri" w:hAnsi="Calibri"/>
                 <w:sz w:val="18"/>
               </w:rPr>
+              <w:t>25</w:t>
+            </w:r>
+          </w:p>
+        </w:tc>
+        <w:tc>
+          <w:tcPr>
+            <w:tcW w:w="960" w:type="dxa"/>
+          </w:tcPr>
+          <w:p>
+            <w:pPr>
+              <w:spacing w:line="240" w:lineRule="auto"/>
+              <w:jc w:val="right"/>
+            </w:pPr>
+            <w:r>
+              <w:rPr>
+                <w:rFonts w:ascii="Calibri" w:hAnsi="Calibri"/>
+                <w:sz w:val="18"/>
+              </w:rPr>
               <w:t>46</w:t>
-            </w:r>
-          </w:p>
-        </w:tc>
-        <w:tc>
-          <w:tcPr>
-            <w:tcW w:w="960" w:type="dxa"/>
-          </w:tcPr>
-          <w:p>
-            <w:pPr>
-              <w:spacing w:line="240" w:lineRule="auto"/>
-              <w:jc w:val="right"/>
-            </w:pPr>
-            <w:r>
-              <w:rPr>
-                <w:rFonts w:ascii="Calibri" w:hAnsi="Calibri"/>
-                <w:sz w:val="18"/>
-              </w:rPr>
-              <w:t>25</w:t>
             </w:r>
           </w:p>
         </w:tc>
@@ -11613,25 +11613,25 @@
                 <w:rFonts w:ascii="Calibri" w:hAnsi="Calibri"/>
                 <w:sz w:val="18"/>
               </w:rPr>
+              <w:t>31</w:t>
+            </w:r>
+          </w:p>
+        </w:tc>
+        <w:tc>
+          <w:tcPr>
+            <w:tcW w:w="960" w:type="dxa"/>
+          </w:tcPr>
+          <w:p>
+            <w:pPr>
+              <w:spacing w:line="240" w:lineRule="auto"/>
+              <w:jc w:val="right"/>
+            </w:pPr>
+            <w:r>
+              <w:rPr>
+                <w:rFonts w:ascii="Calibri" w:hAnsi="Calibri"/>
+                <w:sz w:val="18"/>
+              </w:rPr>
               <w:t>46</w:t>
-            </w:r>
-          </w:p>
-        </w:tc>
-        <w:tc>
-          <w:tcPr>
-            <w:tcW w:w="960" w:type="dxa"/>
-          </w:tcPr>
-          <w:p>
-            <w:pPr>
-              <w:spacing w:line="240" w:lineRule="auto"/>
-              <w:jc w:val="right"/>
-            </w:pPr>
-            <w:r>
-              <w:rPr>
-                <w:rFonts w:ascii="Calibri" w:hAnsi="Calibri"/>
-                <w:sz w:val="18"/>
-              </w:rPr>
-              <w:t>31</w:t>
             </w:r>
           </w:p>
         </w:tc>
@@ -11944,25 +11944,25 @@
                 <w:rFonts w:ascii="Calibri" w:hAnsi="Calibri"/>
                 <w:sz w:val="18"/>
               </w:rPr>
+              <w:t>18</w:t>
+            </w:r>
+          </w:p>
+        </w:tc>
+        <w:tc>
+          <w:tcPr>
+            <w:tcW w:w="960" w:type="dxa"/>
+          </w:tcPr>
+          <w:p>
+            <w:pPr>
+              <w:spacing w:line="240" w:lineRule="auto"/>
+              <w:jc w:val="right"/>
+            </w:pPr>
+            <w:r>
+              <w:rPr>
+                <w:rFonts w:ascii="Calibri" w:hAnsi="Calibri"/>
+                <w:sz w:val="18"/>
+              </w:rPr>
               <w:t>33</w:t>
-            </w:r>
-          </w:p>
-        </w:tc>
-        <w:tc>
-          <w:tcPr>
-            <w:tcW w:w="960" w:type="dxa"/>
-          </w:tcPr>
-          <w:p>
-            <w:pPr>
-              <w:spacing w:line="240" w:lineRule="auto"/>
-              <w:jc w:val="right"/>
-            </w:pPr>
-            <w:r>
-              <w:rPr>
-                <w:rFonts w:ascii="Calibri" w:hAnsi="Calibri"/>
-                <w:sz w:val="18"/>
-              </w:rPr>
-              <w:t>18</w:t>
             </w:r>
           </w:p>
         </w:tc>
@@ -12118,25 +12118,25 @@
                 <w:rFonts w:ascii="Calibri" w:hAnsi="Calibri"/>
                 <w:sz w:val="18"/>
               </w:rPr>
+              <w:t>38</w:t>
+            </w:r>
+          </w:p>
+        </w:tc>
+        <w:tc>
+          <w:tcPr>
+            <w:tcW w:w="960" w:type="dxa"/>
+          </w:tcPr>
+          <w:p>
+            <w:pPr>
+              <w:spacing w:line="240" w:lineRule="auto"/>
+              <w:jc w:val="right"/>
+            </w:pPr>
+            <w:r>
+              <w:rPr>
+                <w:rFonts w:ascii="Calibri" w:hAnsi="Calibri"/>
+                <w:sz w:val="18"/>
+              </w:rPr>
               <w:t>33</w:t>
-            </w:r>
-          </w:p>
-        </w:tc>
-        <w:tc>
-          <w:tcPr>
-            <w:tcW w:w="960" w:type="dxa"/>
-          </w:tcPr>
-          <w:p>
-            <w:pPr>
-              <w:spacing w:line="240" w:lineRule="auto"/>
-              <w:jc w:val="right"/>
-            </w:pPr>
-            <w:r>
-              <w:rPr>
-                <w:rFonts w:ascii="Calibri" w:hAnsi="Calibri"/>
-                <w:sz w:val="18"/>
-              </w:rPr>
-              <w:t>38</w:t>
             </w:r>
           </w:p>
         </w:tc>
@@ -12292,25 +12292,25 @@
                 <w:rFonts w:ascii="Calibri" w:hAnsi="Calibri"/>
                 <w:sz w:val="18"/>
               </w:rPr>
+              <w:t>30</w:t>
+            </w:r>
+          </w:p>
+        </w:tc>
+        <w:tc>
+          <w:tcPr>
+            <w:tcW w:w="960" w:type="dxa"/>
+          </w:tcPr>
+          <w:p>
+            <w:pPr>
+              <w:spacing w:line="240" w:lineRule="auto"/>
+              <w:jc w:val="right"/>
+            </w:pPr>
+            <w:r>
+              <w:rPr>
+                <w:rFonts w:ascii="Calibri" w:hAnsi="Calibri"/>
+                <w:sz w:val="18"/>
+              </w:rPr>
               <w:t>33</w:t>
-            </w:r>
-          </w:p>
-        </w:tc>
-        <w:tc>
-          <w:tcPr>
-            <w:tcW w:w="960" w:type="dxa"/>
-          </w:tcPr>
-          <w:p>
-            <w:pPr>
-              <w:spacing w:line="240" w:lineRule="auto"/>
-              <w:jc w:val="right"/>
-            </w:pPr>
-            <w:r>
-              <w:rPr>
-                <w:rFonts w:ascii="Calibri" w:hAnsi="Calibri"/>
-                <w:sz w:val="18"/>
-              </w:rPr>
-              <w:t>30</w:t>
             </w:r>
           </w:p>
         </w:tc>
@@ -12466,25 +12466,25 @@
                 <w:rFonts w:ascii="Calibri" w:hAnsi="Calibri"/>
                 <w:sz w:val="18"/>
               </w:rPr>
+              <w:t>25</w:t>
+            </w:r>
+          </w:p>
+        </w:tc>
+        <w:tc>
+          <w:tcPr>
+            <w:tcW w:w="960" w:type="dxa"/>
+          </w:tcPr>
+          <w:p>
+            <w:pPr>
+              <w:spacing w:line="240" w:lineRule="auto"/>
+              <w:jc w:val="right"/>
+            </w:pPr>
+            <w:r>
+              <w:rPr>
+                <w:rFonts w:ascii="Calibri" w:hAnsi="Calibri"/>
+                <w:sz w:val="18"/>
+              </w:rPr>
               <w:t>33</w:t>
-            </w:r>
-          </w:p>
-        </w:tc>
-        <w:tc>
-          <w:tcPr>
-            <w:tcW w:w="960" w:type="dxa"/>
-          </w:tcPr>
-          <w:p>
-            <w:pPr>
-              <w:spacing w:line="240" w:lineRule="auto"/>
-              <w:jc w:val="right"/>
-            </w:pPr>
-            <w:r>
-              <w:rPr>
-                <w:rFonts w:ascii="Calibri" w:hAnsi="Calibri"/>
-                <w:sz w:val="18"/>
-              </w:rPr>
-              <w:t>25</w:t>
             </w:r>
           </w:p>
         </w:tc>
@@ -12640,25 +12640,25 @@
                 <w:rFonts w:ascii="Calibri" w:hAnsi="Calibri"/>
                 <w:sz w:val="18"/>
               </w:rPr>
+              <w:t>31</w:t>
+            </w:r>
+          </w:p>
+        </w:tc>
+        <w:tc>
+          <w:tcPr>
+            <w:tcW w:w="960" w:type="dxa"/>
+          </w:tcPr>
+          <w:p>
+            <w:pPr>
+              <w:spacing w:line="240" w:lineRule="auto"/>
+              <w:jc w:val="right"/>
+            </w:pPr>
+            <w:r>
+              <w:rPr>
+                <w:rFonts w:ascii="Calibri" w:hAnsi="Calibri"/>
+                <w:sz w:val="18"/>
+              </w:rPr>
               <w:t>33</w:t>
-            </w:r>
-          </w:p>
-        </w:tc>
-        <w:tc>
-          <w:tcPr>
-            <w:tcW w:w="960" w:type="dxa"/>
-          </w:tcPr>
-          <w:p>
-            <w:pPr>
-              <w:spacing w:line="240" w:lineRule="auto"/>
-              <w:jc w:val="right"/>
-            </w:pPr>
-            <w:r>
-              <w:rPr>
-                <w:rFonts w:ascii="Calibri" w:hAnsi="Calibri"/>
-                <w:sz w:val="18"/>
-              </w:rPr>
-              <w:t>31</w:t>
             </w:r>
           </w:p>
         </w:tc>
@@ -12971,25 +12971,25 @@
                 <w:rFonts w:ascii="Calibri" w:hAnsi="Calibri"/>
                 <w:sz w:val="18"/>
               </w:rPr>
+              <w:t>18</w:t>
+            </w:r>
+          </w:p>
+        </w:tc>
+        <w:tc>
+          <w:tcPr>
+            <w:tcW w:w="960" w:type="dxa"/>
+          </w:tcPr>
+          <w:p>
+            <w:pPr>
+              <w:spacing w:line="240" w:lineRule="auto"/>
+              <w:jc w:val="right"/>
+            </w:pPr>
+            <w:r>
+              <w:rPr>
+                <w:rFonts w:ascii="Calibri" w:hAnsi="Calibri"/>
+                <w:sz w:val="18"/>
+              </w:rPr>
               <w:t>31</w:t>
-            </w:r>
-          </w:p>
-        </w:tc>
-        <w:tc>
-          <w:tcPr>
-            <w:tcW w:w="960" w:type="dxa"/>
-          </w:tcPr>
-          <w:p>
-            <w:pPr>
-              <w:spacing w:line="240" w:lineRule="auto"/>
-              <w:jc w:val="right"/>
-            </w:pPr>
-            <w:r>
-              <w:rPr>
-                <w:rFonts w:ascii="Calibri" w:hAnsi="Calibri"/>
-                <w:sz w:val="18"/>
-              </w:rPr>
-              <w:t>18</w:t>
             </w:r>
           </w:p>
         </w:tc>
@@ -13145,25 +13145,25 @@
                 <w:rFonts w:ascii="Calibri" w:hAnsi="Calibri"/>
                 <w:sz w:val="18"/>
               </w:rPr>
+              <w:t>38</w:t>
+            </w:r>
+          </w:p>
+        </w:tc>
+        <w:tc>
+          <w:tcPr>
+            <w:tcW w:w="960" w:type="dxa"/>
+          </w:tcPr>
+          <w:p>
+            <w:pPr>
+              <w:spacing w:line="240" w:lineRule="auto"/>
+              <w:jc w:val="right"/>
+            </w:pPr>
+            <w:r>
+              <w:rPr>
+                <w:rFonts w:ascii="Calibri" w:hAnsi="Calibri"/>
+                <w:sz w:val="18"/>
+              </w:rPr>
               <w:t>31</w:t>
-            </w:r>
-          </w:p>
-        </w:tc>
-        <w:tc>
-          <w:tcPr>
-            <w:tcW w:w="960" w:type="dxa"/>
-          </w:tcPr>
-          <w:p>
-            <w:pPr>
-              <w:spacing w:line="240" w:lineRule="auto"/>
-              <w:jc w:val="right"/>
-            </w:pPr>
-            <w:r>
-              <w:rPr>
-                <w:rFonts w:ascii="Calibri" w:hAnsi="Calibri"/>
-                <w:sz w:val="18"/>
-              </w:rPr>
-              <w:t>38</w:t>
             </w:r>
           </w:p>
         </w:tc>
@@ -13319,25 +13319,25 @@
                 <w:rFonts w:ascii="Calibri" w:hAnsi="Calibri"/>
                 <w:sz w:val="18"/>
               </w:rPr>
+              <w:t>30</w:t>
+            </w:r>
+          </w:p>
+        </w:tc>
+        <w:tc>
+          <w:tcPr>
+            <w:tcW w:w="960" w:type="dxa"/>
+          </w:tcPr>
+          <w:p>
+            <w:pPr>
+              <w:spacing w:line="240" w:lineRule="auto"/>
+              <w:jc w:val="right"/>
+            </w:pPr>
+            <w:r>
+              <w:rPr>
+                <w:rFonts w:ascii="Calibri" w:hAnsi="Calibri"/>
+                <w:sz w:val="18"/>
+              </w:rPr>
               <w:t>31</w:t>
-            </w:r>
-          </w:p>
-        </w:tc>
-        <w:tc>
-          <w:tcPr>
-            <w:tcW w:w="960" w:type="dxa"/>
-          </w:tcPr>
-          <w:p>
-            <w:pPr>
-              <w:spacing w:line="240" w:lineRule="auto"/>
-              <w:jc w:val="right"/>
-            </w:pPr>
-            <w:r>
-              <w:rPr>
-                <w:rFonts w:ascii="Calibri" w:hAnsi="Calibri"/>
-                <w:sz w:val="18"/>
-              </w:rPr>
-              <w:t>30</w:t>
             </w:r>
           </w:p>
         </w:tc>
@@ -13493,25 +13493,25 @@
                 <w:rFonts w:ascii="Calibri" w:hAnsi="Calibri"/>
                 <w:sz w:val="18"/>
               </w:rPr>
+              <w:t>25</w:t>
+            </w:r>
+          </w:p>
+        </w:tc>
+        <w:tc>
+          <w:tcPr>
+            <w:tcW w:w="960" w:type="dxa"/>
+          </w:tcPr>
+          <w:p>
+            <w:pPr>
+              <w:spacing w:line="240" w:lineRule="auto"/>
+              <w:jc w:val="right"/>
+            </w:pPr>
+            <w:r>
+              <w:rPr>
+                <w:rFonts w:ascii="Calibri" w:hAnsi="Calibri"/>
+                <w:sz w:val="18"/>
+              </w:rPr>
               <w:t>31</w:t>
-            </w:r>
-          </w:p>
-        </w:tc>
-        <w:tc>
-          <w:tcPr>
-            <w:tcW w:w="960" w:type="dxa"/>
-          </w:tcPr>
-          <w:p>
-            <w:pPr>
-              <w:spacing w:line="240" w:lineRule="auto"/>
-              <w:jc w:val="right"/>
-            </w:pPr>
-            <w:r>
-              <w:rPr>
-                <w:rFonts w:ascii="Calibri" w:hAnsi="Calibri"/>
-                <w:sz w:val="18"/>
-              </w:rPr>
-              <w:t>25</w:t>
             </w:r>
           </w:p>
         </w:tc>

</xml_diff>